<commit_message>
Generate CMR non-stress reports from cvi42 exports
Co-authored-by: Copilot App <223556219+Copilot@users.noreply.github.com>
</commit_message>
<xml_diff>
--- a/AI_agent/CMR_Non_Stress_Report_Final.docx
+++ b/AI_agent/CMR_Non_Stress_Report_Final.docx
@@ -120,67 +120,81 @@
         </w:rPr>
       </w:pPr>
       <w:r>
-        <w:t>CLINICAL HISTORY: Evaluation of cardiac structure and function.</w:t>
-      </w:r>
-    </w:p>
-    <w:p>
-      <w:pPr>
-        <w:tabs>
-          <w:tab w:val="left" w:pos="720"/>
-          <w:tab w:val="left" w:pos="1440"/>
-          <w:tab w:val="left" w:pos="2160"/>
-          <w:tab w:val="left" w:pos="2880"/>
-          <w:tab w:val="left" w:pos="3600"/>
-          <w:tab w:val="left" w:pos="4320"/>
-          <w:tab w:val="left" w:pos="5040"/>
-          <w:tab w:val="left" w:pos="5760"/>
-          <w:tab w:val="left" w:pos="6480"/>
-          <w:tab w:val="left" w:pos="7200"/>
-          <w:tab w:val="left" w:pos="7920"/>
-          <w:tab w:val="left" w:pos="8640"/>
-          <w:tab w:val="left" w:pos="9360"/>
-          <w:tab w:val="left" w:pos="10080"/>
-        </w:tabs>
-        <w:spacing w:after="0" w:line="240" w:lineRule="auto"/>
-        <w:rPr>
-          <w:rFonts w:ascii="Arial" w:eastAsia="Arial" w:hAnsi="Arial" w:cs="Arial"/>
-          <w:sz w:val="20"/>
-          <w:szCs w:val="20"/>
-        </w:rPr>
-      </w:pPr>
-    </w:p>
-    <w:p>
-      <w:pPr>
-        <w:tabs>
-          <w:tab w:val="left" w:pos="720"/>
-          <w:tab w:val="left" w:pos="1440"/>
-          <w:tab w:val="left" w:pos="2160"/>
-          <w:tab w:val="left" w:pos="2880"/>
-          <w:tab w:val="left" w:pos="3600"/>
-          <w:tab w:val="left" w:pos="4320"/>
-          <w:tab w:val="left" w:pos="5040"/>
-          <w:tab w:val="left" w:pos="5760"/>
-          <w:tab w:val="left" w:pos="6480"/>
-          <w:tab w:val="left" w:pos="7200"/>
-          <w:tab w:val="left" w:pos="7920"/>
-          <w:tab w:val="left" w:pos="8640"/>
-          <w:tab w:val="left" w:pos="9360"/>
-          <w:tab w:val="left" w:pos="10080"/>
-        </w:tabs>
-        <w:spacing w:after="0" w:line="240" w:lineRule="auto"/>
-        <w:rPr>
-          <w:rFonts w:ascii="Arial" w:eastAsia="Arial" w:hAnsi="Arial" w:cs="Arial"/>
-          <w:sz w:val="20"/>
-          <w:szCs w:val="20"/>
-        </w:rPr>
-      </w:pPr>
-      <w:r>
         <w:rPr>
           <w:rFonts w:ascii="Arial" w:eastAsia="Arial" w:hAnsi="Arial" w:cs="Arial"/>
           <w:b/>
           <w:sz w:val="20"/>
           <w:szCs w:val="20"/>
         </w:rPr>
+        <w:t xml:space="preserve">CLINICAL HISTORY: </w:t>
+      </w:r>
+      <w:r>
+        <w:rPr>
+          <w:rFonts w:ascii="Arial" w:eastAsia="Arial" w:hAnsi="Arial" w:cs="Arial"/>
+          <w:sz w:val="20"/>
+          <w:szCs w:val="20"/>
+        </w:rPr>
+        <w:t>Not provided in source export.</w:t>
+      </w:r>
+    </w:p>
+    <w:p>
+      <w:pPr>
+        <w:tabs>
+          <w:tab w:val="left" w:pos="720"/>
+          <w:tab w:val="left" w:pos="1440"/>
+          <w:tab w:val="left" w:pos="2160"/>
+          <w:tab w:val="left" w:pos="2880"/>
+          <w:tab w:val="left" w:pos="3600"/>
+          <w:tab w:val="left" w:pos="4320"/>
+          <w:tab w:val="left" w:pos="5040"/>
+          <w:tab w:val="left" w:pos="5760"/>
+          <w:tab w:val="left" w:pos="6480"/>
+          <w:tab w:val="left" w:pos="7200"/>
+          <w:tab w:val="left" w:pos="7920"/>
+          <w:tab w:val="left" w:pos="8640"/>
+          <w:tab w:val="left" w:pos="9360"/>
+          <w:tab w:val="left" w:pos="10080"/>
+        </w:tabs>
+        <w:spacing w:after="0" w:line="240" w:lineRule="auto"/>
+        <w:rPr>
+          <w:rFonts w:ascii="Arial" w:eastAsia="Arial" w:hAnsi="Arial" w:cs="Arial"/>
+          <w:sz w:val="20"/>
+          <w:szCs w:val="20"/>
+        </w:rPr>
+      </w:pPr>
+    </w:p>
+    <w:p>
+      <w:pPr>
+        <w:tabs>
+          <w:tab w:val="left" w:pos="720"/>
+          <w:tab w:val="left" w:pos="1440"/>
+          <w:tab w:val="left" w:pos="2160"/>
+          <w:tab w:val="left" w:pos="2880"/>
+          <w:tab w:val="left" w:pos="3600"/>
+          <w:tab w:val="left" w:pos="4320"/>
+          <w:tab w:val="left" w:pos="5040"/>
+          <w:tab w:val="left" w:pos="5760"/>
+          <w:tab w:val="left" w:pos="6480"/>
+          <w:tab w:val="left" w:pos="7200"/>
+          <w:tab w:val="left" w:pos="7920"/>
+          <w:tab w:val="left" w:pos="8640"/>
+          <w:tab w:val="left" w:pos="9360"/>
+          <w:tab w:val="left" w:pos="10080"/>
+        </w:tabs>
+        <w:spacing w:after="0" w:line="240" w:lineRule="auto"/>
+        <w:rPr>
+          <w:rFonts w:ascii="Arial" w:eastAsia="Arial" w:hAnsi="Arial" w:cs="Arial"/>
+          <w:sz w:val="20"/>
+          <w:szCs w:val="20"/>
+        </w:rPr>
+      </w:pPr>
+      <w:r>
+        <w:rPr>
+          <w:rFonts w:ascii="Arial" w:eastAsia="Arial" w:hAnsi="Arial" w:cs="Arial"/>
+          <w:b/>
+          <w:sz w:val="20"/>
+          <w:szCs w:val="20"/>
+        </w:rPr>
         <w:t>TECHNIQUE:</w:t>
       </w:r>
       <w:r>
@@ -262,68 +276,119 @@
         </w:rPr>
       </w:pPr>
       <w:r>
-        <w:t>SCANNER: GE Signa Premier 3T.</w:t>
-      </w:r>
-    </w:p>
-    <w:p>
-      <w:pPr>
-        <w:tabs>
-          <w:tab w:val="left" w:pos="720"/>
-          <w:tab w:val="left" w:pos="1440"/>
-          <w:tab w:val="left" w:pos="2160"/>
-          <w:tab w:val="left" w:pos="2880"/>
-          <w:tab w:val="left" w:pos="3600"/>
-          <w:tab w:val="left" w:pos="4320"/>
-          <w:tab w:val="left" w:pos="5040"/>
-          <w:tab w:val="left" w:pos="5760"/>
-          <w:tab w:val="left" w:pos="6480"/>
-          <w:tab w:val="left" w:pos="7200"/>
-          <w:tab w:val="left" w:pos="7920"/>
-          <w:tab w:val="left" w:pos="8640"/>
-          <w:tab w:val="left" w:pos="9360"/>
-          <w:tab w:val="left" w:pos="10080"/>
-        </w:tabs>
-        <w:spacing w:after="0" w:line="240" w:lineRule="auto"/>
-        <w:rPr>
-          <w:rFonts w:ascii="Arial" w:eastAsia="Arial" w:hAnsi="Arial" w:cs="Arial"/>
-          <w:sz w:val="20"/>
-          <w:szCs w:val="20"/>
-        </w:rPr>
-      </w:pPr>
-    </w:p>
-    <w:p>
-      <w:pPr>
-        <w:tabs>
-          <w:tab w:val="left" w:pos="720"/>
-          <w:tab w:val="left" w:pos="1440"/>
-          <w:tab w:val="left" w:pos="2160"/>
-          <w:tab w:val="left" w:pos="2880"/>
-          <w:tab w:val="left" w:pos="3600"/>
-          <w:tab w:val="left" w:pos="4320"/>
-          <w:tab w:val="left" w:pos="5040"/>
-          <w:tab w:val="left" w:pos="5760"/>
-          <w:tab w:val="left" w:pos="6480"/>
-          <w:tab w:val="left" w:pos="7200"/>
-          <w:tab w:val="left" w:pos="7920"/>
-          <w:tab w:val="left" w:pos="8640"/>
-          <w:tab w:val="left" w:pos="9360"/>
-          <w:tab w:val="left" w:pos="10080"/>
-        </w:tabs>
-        <w:spacing w:after="0" w:line="240" w:lineRule="auto"/>
         <w:rPr>
           <w:rFonts w:ascii="Arial" w:eastAsia="Arial" w:hAnsi="Arial" w:cs="Arial"/>
           <w:b/>
           <w:sz w:val="20"/>
           <w:szCs w:val="20"/>
         </w:rPr>
-      </w:pPr>
-      <w:r>
+        <w:t xml:space="preserve">SCANNER: </w:t>
+      </w:r>
+      <w:r>
+        <w:rPr>
+          <w:rFonts w:ascii="Arial" w:eastAsia="Arial" w:hAnsi="Arial" w:cs="Arial"/>
+          <w:sz w:val="20"/>
+          <w:szCs w:val="20"/>
+        </w:rPr>
+        <w:t>Not provided in source export.</w:t>
+      </w:r>
+      <w:r>
+        <w:rPr>
+          <w:rFonts w:ascii="Arial" w:eastAsia="Arial" w:hAnsi="Arial" w:cs="Arial"/>
+          <w:sz w:val="20"/>
+          <w:szCs w:val="20"/>
+        </w:rPr>
+      </w:r>
+      <w:r>
+        <w:rPr>
+          <w:rFonts w:ascii="Arial" w:eastAsia="Arial" w:hAnsi="Arial" w:cs="Arial"/>
+          <w:sz w:val="20"/>
+          <w:szCs w:val="20"/>
+        </w:rPr>
+      </w:r>
+      <w:proofErr w:type="spellStart"/>
+      <w:r>
+        <w:rPr>
+          <w:rFonts w:ascii="Arial" w:eastAsia="Arial" w:hAnsi="Arial" w:cs="Arial"/>
+          <w:sz w:val="20"/>
+          <w:szCs w:val="20"/>
+        </w:rPr>
+      </w:r>
+      <w:proofErr w:type="spellEnd"/>
+      <w:r>
+        <w:rPr>
+          <w:rFonts w:ascii="Arial" w:eastAsia="Arial" w:hAnsi="Arial" w:cs="Arial"/>
+          <w:sz w:val="20"/>
+          <w:szCs w:val="20"/>
+        </w:rPr>
+      </w:r>
+      <w:r>
+        <w:rPr>
+          <w:rFonts w:ascii="Arial" w:hAnsi="Arial" w:cs="Arial"/>
+          <w:sz w:val="20"/>
+          <w:szCs w:val="20"/>
+        </w:rPr>
+      </w:r>
+    </w:p>
+    <w:p>
+      <w:pPr>
+        <w:tabs>
+          <w:tab w:val="left" w:pos="720"/>
+          <w:tab w:val="left" w:pos="1440"/>
+          <w:tab w:val="left" w:pos="2160"/>
+          <w:tab w:val="left" w:pos="2880"/>
+          <w:tab w:val="left" w:pos="3600"/>
+          <w:tab w:val="left" w:pos="4320"/>
+          <w:tab w:val="left" w:pos="5040"/>
+          <w:tab w:val="left" w:pos="5760"/>
+          <w:tab w:val="left" w:pos="6480"/>
+          <w:tab w:val="left" w:pos="7200"/>
+          <w:tab w:val="left" w:pos="7920"/>
+          <w:tab w:val="left" w:pos="8640"/>
+          <w:tab w:val="left" w:pos="9360"/>
+          <w:tab w:val="left" w:pos="10080"/>
+        </w:tabs>
+        <w:spacing w:after="0" w:line="240" w:lineRule="auto"/>
+        <w:rPr>
+          <w:rFonts w:ascii="Arial" w:eastAsia="Arial" w:hAnsi="Arial" w:cs="Arial"/>
+          <w:sz w:val="20"/>
+          <w:szCs w:val="20"/>
+        </w:rPr>
+      </w:pPr>
+    </w:p>
+    <w:p>
+      <w:pPr>
+        <w:tabs>
+          <w:tab w:val="left" w:pos="720"/>
+          <w:tab w:val="left" w:pos="1440"/>
+          <w:tab w:val="left" w:pos="2160"/>
+          <w:tab w:val="left" w:pos="2880"/>
+          <w:tab w:val="left" w:pos="3600"/>
+          <w:tab w:val="left" w:pos="4320"/>
+          <w:tab w:val="left" w:pos="5040"/>
+          <w:tab w:val="left" w:pos="5760"/>
+          <w:tab w:val="left" w:pos="6480"/>
+          <w:tab w:val="left" w:pos="7200"/>
+          <w:tab w:val="left" w:pos="7920"/>
+          <w:tab w:val="left" w:pos="8640"/>
+          <w:tab w:val="left" w:pos="9360"/>
+          <w:tab w:val="left" w:pos="10080"/>
+        </w:tabs>
+        <w:spacing w:after="0" w:line="240" w:lineRule="auto"/>
         <w:rPr>
           <w:rFonts w:ascii="Arial" w:eastAsia="Arial" w:hAnsi="Arial" w:cs="Arial"/>
           <w:b/>
           <w:sz w:val="20"/>
           <w:szCs w:val="20"/>
         </w:rPr>
+      </w:pPr>
+      <w:r>
+        <w:rPr>
+          <w:rFonts w:ascii="Arial" w:eastAsia="Arial" w:hAnsi="Arial" w:cs="Arial"/>
+          <w:b/>
+          <w:sz w:val="20"/>
+          <w:szCs w:val="20"/>
+        </w:rPr>
         <w:t>FINDINGS:</w:t>
       </w:r>
     </w:p>
@@ -353,7 +418,40 @@
         </w:rPr>
       </w:pPr>
       <w:r>
-        <w:t>No previous cardiac MRI available for comparison.</w:t>
+        <w:rPr>
+          <w:rFonts w:ascii="Arial" w:eastAsia="Arial" w:hAnsi="Arial" w:cs="Arial"/>
+          <w:sz w:val="20"/>
+          <w:szCs w:val="20"/>
+        </w:rPr>
+        <w:t>Comparison with previous cardiac MRI: Not provided in source export.</w:t>
+      </w:r>
+      <w:r>
+        <w:rPr>
+          <w:rFonts w:ascii="Arial" w:eastAsia="Arial" w:hAnsi="Arial" w:cs="Arial"/>
+          <w:sz w:val="20"/>
+          <w:szCs w:val="20"/>
+        </w:rPr>
+      </w:r>
+      <w:r>
+        <w:rPr>
+          <w:rFonts w:ascii="Arial" w:hAnsi="Arial" w:cs="Arial"/>
+          <w:sz w:val="20"/>
+          <w:szCs w:val="20"/>
+        </w:rPr>
+      </w:r>
+      <w:r>
+        <w:rPr>
+          <w:rFonts w:ascii="Arial" w:hAnsi="Arial" w:cs="Arial"/>
+          <w:sz w:val="20"/>
+          <w:szCs w:val="20"/>
+        </w:rPr>
+      </w:r>
+      <w:r>
+        <w:rPr>
+          <w:rFonts w:ascii="Arial" w:hAnsi="Arial" w:cs="Arial"/>
+          <w:sz w:val="20"/>
+          <w:szCs w:val="20"/>
+        </w:rPr>
       </w:r>
     </w:p>
     <w:p>
@@ -411,7 +509,71 @@
         </w:rPr>
       </w:pPr>
       <w:r>
-        <w:t>Cardiovascular Anatomy: Normal atrioventricular and ventriculoarterial connections. Normal drainage of the SVC and IVC into the right atrium. Normal pulmonary venous drainage into the left atrium.</w:t>
+        <w:rPr>
+          <w:rFonts w:ascii="Arial" w:hAnsi="Arial" w:cs="Arial"/>
+          <w:i/>
+          <w:sz w:val="20"/>
+          <w:szCs w:val="20"/>
+          <w:u w:val="single"/>
+        </w:rPr>
+        <w:t xml:space="preserve">Cardiovascular Anatomy: </w:t>
+      </w:r>
+      <w:r>
+        <w:rPr>
+          <w:rFonts w:ascii="Arial" w:hAnsi="Arial" w:cs="Arial"/>
+          <w:sz w:val="20"/>
+          <w:szCs w:val="20"/>
+        </w:rPr>
+        <w:t>Not provided in source export.</w:t>
+      </w:r>
+      <w:r>
+        <w:rPr>
+          <w:rFonts w:ascii="Arial" w:hAnsi="Arial" w:cs="Arial"/>
+          <w:sz w:val="20"/>
+          <w:szCs w:val="20"/>
+        </w:rPr>
+      </w:r>
+      <w:r>
+        <w:rPr>
+          <w:rFonts w:ascii="Arial" w:hAnsi="Arial" w:cs="Arial"/>
+          <w:sz w:val="20"/>
+          <w:szCs w:val="20"/>
+        </w:rPr>
+      </w:r>
+      <w:r>
+        <w:rPr>
+          <w:rFonts w:ascii="Arial" w:hAnsi="Arial" w:cs="Arial"/>
+          <w:sz w:val="20"/>
+          <w:szCs w:val="20"/>
+        </w:rPr>
+      </w:r>
+      <w:r>
+        <w:rPr>
+          <w:rFonts w:ascii="Arial" w:hAnsi="Arial" w:cs="Arial"/>
+          <w:sz w:val="20"/>
+          <w:szCs w:val="20"/>
+        </w:rPr>
+      </w:r>
+      <w:r>
+        <w:rPr>
+          <w:rFonts w:ascii="Arial" w:hAnsi="Arial" w:cs="Arial"/>
+          <w:sz w:val="20"/>
+          <w:szCs w:val="20"/>
+        </w:rPr>
+      </w:r>
+      <w:r>
+        <w:rPr>
+          <w:rFonts w:ascii="Arial" w:hAnsi="Arial" w:cs="Arial"/>
+          <w:sz w:val="20"/>
+          <w:szCs w:val="20"/>
+        </w:rPr>
+      </w:r>
+      <w:r>
+        <w:rPr>
+          <w:rFonts w:ascii="Arial" w:hAnsi="Arial" w:cs="Arial"/>
+          <w:sz w:val="20"/>
+          <w:szCs w:val="20"/>
+        </w:rPr>
       </w:r>
     </w:p>
     <w:p>
@@ -472,7 +634,22 @@
         </w:rPr>
       </w:pPr>
       <w:r>
-        <w:t>Aorta: Not dilated. Aortic sinus measures 32 mm in diameter.</w:t>
+        <w:rPr>
+          <w:rFonts w:ascii="Arial" w:hAnsi="Arial" w:cs="Arial"/>
+          <w:i/>
+          <w:sz w:val="20"/>
+          <w:szCs w:val="20"/>
+          <w:u w:val="single"/>
+        </w:rPr>
+        <w:t xml:space="preserve">Aorta: </w:t>
+      </w:r>
+      <w:r>
+        <w:rPr>
+          <w:rFonts w:ascii="Arial" w:hAnsi="Arial" w:cs="Arial"/>
+          <w:sz w:val="20"/>
+          <w:szCs w:val="20"/>
+        </w:rPr>
+        <w:t>Aortic sinus measurement Not provided in source export.</w:t>
       </w:r>
     </w:p>
     <w:p>
@@ -533,7 +710,93 @@
         </w:rPr>
       </w:pPr>
       <w:r>
-        <w:t>Main pulmonary artery is not dilated. Diameter is 24 mm. No evidence of pulmonary hypertension.</w:t>
+        <w:rPr>
+          <w:rFonts w:ascii="Arial" w:hAnsi="Arial" w:cs="Arial"/>
+          <w:i/>
+          <w:sz w:val="20"/>
+          <w:szCs w:val="20"/>
+          <w:u w:val="single"/>
+        </w:rPr>
+        <w:t xml:space="preserve">Pulmonary Arteries: </w:t>
+      </w:r>
+      <w:r>
+        <w:rPr>
+          <w:rFonts w:ascii="Arial" w:hAnsi="Arial" w:cs="Arial"/>
+          <w:sz w:val="20"/>
+          <w:szCs w:val="20"/>
+        </w:rPr>
+        <w:t>Main pulmonary artery assessment Not provided in source export.</w:t>
+      </w:r>
+      <w:r>
+        <w:rPr>
+          <w:rFonts w:ascii="Arial" w:hAnsi="Arial" w:cs="Arial"/>
+          <w:sz w:val="20"/>
+          <w:szCs w:val="20"/>
+        </w:rPr>
+      </w:r>
+      <w:r>
+        <w:rPr>
+          <w:rFonts w:ascii="Arial" w:hAnsi="Arial" w:cs="Arial"/>
+          <w:sz w:val="20"/>
+          <w:szCs w:val="20"/>
+        </w:rPr>
+      </w:r>
+      <w:r>
+        <w:rPr>
+          <w:rFonts w:ascii="Arial" w:hAnsi="Arial" w:cs="Arial"/>
+          <w:sz w:val="20"/>
+          <w:szCs w:val="20"/>
+        </w:rPr>
+      </w:r>
+      <w:bookmarkStart w:id="1" w:name="_Hlk199406645"/>
+      <w:r>
+        <w:rPr>
+          <w:rFonts w:ascii="Arial" w:hAnsi="Arial" w:cs="Arial"/>
+          <w:sz w:val="20"/>
+          <w:szCs w:val="20"/>
+        </w:rPr>
+      </w:r>
+      <w:r>
+        <w:rPr>
+          <w:rFonts w:ascii="Arial" w:hAnsi="Arial" w:cs="Arial"/>
+          <w:sz w:val="20"/>
+          <w:szCs w:val="20"/>
+        </w:rPr>
+      </w:r>
+      <w:r>
+        <w:rPr>
+          <w:rFonts w:ascii="Arial" w:hAnsi="Arial" w:cs="Arial"/>
+          <w:sz w:val="20"/>
+          <w:szCs w:val="20"/>
+        </w:rPr>
+      </w:r>
+      <w:r>
+        <w:rPr>
+          <w:rFonts w:ascii="Arial" w:hAnsi="Arial" w:cs="Arial"/>
+          <w:sz w:val="20"/>
+          <w:szCs w:val="20"/>
+        </w:rPr>
+      </w:r>
+      <w:r>
+        <w:rPr>
+          <w:rFonts w:ascii="Arial" w:hAnsi="Arial" w:cs="Arial"/>
+          <w:sz w:val="20"/>
+          <w:szCs w:val="20"/>
+        </w:rPr>
+      </w:r>
+      <w:r>
+        <w:rPr>
+          <w:rFonts w:ascii="Arial" w:hAnsi="Arial" w:cs="Arial"/>
+          <w:sz w:val="20"/>
+          <w:szCs w:val="20"/>
+        </w:rPr>
+      </w:r>
+      <w:r>
+        <w:rPr>
+          <w:rFonts w:ascii="Arial" w:hAnsi="Arial" w:cs="Arial"/>
+          <w:sz w:val="20"/>
+          <w:szCs w:val="20"/>
+        </w:rPr>
       </w:r>
     </w:p>
     <w:bookmarkEnd w:id="1"/>
@@ -592,62 +855,92 @@
         </w:rPr>
       </w:pPr>
       <w:r>
-        <w:t>Left Atrium: Normal for size.</w:t>
-      </w:r>
-    </w:p>
-    <w:p>
-      <w:pPr>
-        <w:tabs>
-          <w:tab w:val="left" w:pos="720"/>
-          <w:tab w:val="left" w:pos="1440"/>
-          <w:tab w:val="left" w:pos="2160"/>
-          <w:tab w:val="left" w:pos="2880"/>
-          <w:tab w:val="left" w:pos="3600"/>
-          <w:tab w:val="left" w:pos="4320"/>
-          <w:tab w:val="left" w:pos="5040"/>
-          <w:tab w:val="left" w:pos="5760"/>
-          <w:tab w:val="left" w:pos="6480"/>
-          <w:tab w:val="left" w:pos="7200"/>
-          <w:tab w:val="left" w:pos="7920"/>
-          <w:tab w:val="left" w:pos="8640"/>
-          <w:tab w:val="left" w:pos="9360"/>
-          <w:tab w:val="left" w:pos="10080"/>
-        </w:tabs>
-        <w:spacing w:after="0" w:line="240" w:lineRule="auto"/>
-        <w:rPr>
-          <w:rFonts w:ascii="Arial" w:eastAsia="Arial" w:hAnsi="Arial" w:cs="Arial"/>
-          <w:sz w:val="20"/>
-          <w:szCs w:val="20"/>
-        </w:rPr>
-      </w:pPr>
-    </w:p>
-    <w:p>
-      <w:pPr>
-        <w:tabs>
-          <w:tab w:val="left" w:pos="720"/>
-          <w:tab w:val="left" w:pos="1440"/>
-          <w:tab w:val="left" w:pos="2160"/>
-          <w:tab w:val="left" w:pos="2880"/>
-          <w:tab w:val="left" w:pos="3600"/>
-          <w:tab w:val="left" w:pos="4320"/>
-          <w:tab w:val="left" w:pos="5040"/>
-          <w:tab w:val="left" w:pos="5760"/>
-          <w:tab w:val="left" w:pos="6480"/>
-          <w:tab w:val="left" w:pos="7200"/>
-          <w:tab w:val="left" w:pos="7920"/>
-          <w:tab w:val="left" w:pos="8640"/>
-          <w:tab w:val="left" w:pos="9360"/>
-          <w:tab w:val="left" w:pos="10080"/>
-        </w:tabs>
-        <w:spacing w:after="0" w:line="240" w:lineRule="auto"/>
-        <w:rPr>
-          <w:rFonts w:ascii="Arial" w:eastAsia="Arial" w:hAnsi="Arial" w:cs="Arial"/>
-          <w:sz w:val="20"/>
-          <w:szCs w:val="20"/>
-        </w:rPr>
-      </w:pPr>
-      <w:r>
-        <w:t>Right Atrium: Normal for size.</w:t>
+        <w:rPr>
+          <w:rFonts w:ascii="Arial" w:eastAsia="Arial" w:hAnsi="Arial" w:cs="Arial"/>
+          <w:i/>
+          <w:sz w:val="20"/>
+          <w:szCs w:val="20"/>
+          <w:u w:val="single"/>
+        </w:rPr>
+        <w:t xml:space="preserve">Left Atrium: </w:t>
+      </w:r>
+      <w:r>
+        <w:rPr>
+          <w:rFonts w:ascii="Arial" w:eastAsia="Arial" w:hAnsi="Arial" w:cs="Arial"/>
+          <w:sz w:val="20"/>
+          <w:szCs w:val="20"/>
+        </w:rPr>
+        <w:t>size/reference classification Not provided in source export.</w:t>
+      </w:r>
+    </w:p>
+    <w:p>
+      <w:pPr>
+        <w:tabs>
+          <w:tab w:val="left" w:pos="720"/>
+          <w:tab w:val="left" w:pos="1440"/>
+          <w:tab w:val="left" w:pos="2160"/>
+          <w:tab w:val="left" w:pos="2880"/>
+          <w:tab w:val="left" w:pos="3600"/>
+          <w:tab w:val="left" w:pos="4320"/>
+          <w:tab w:val="left" w:pos="5040"/>
+          <w:tab w:val="left" w:pos="5760"/>
+          <w:tab w:val="left" w:pos="6480"/>
+          <w:tab w:val="left" w:pos="7200"/>
+          <w:tab w:val="left" w:pos="7920"/>
+          <w:tab w:val="left" w:pos="8640"/>
+          <w:tab w:val="left" w:pos="9360"/>
+          <w:tab w:val="left" w:pos="10080"/>
+        </w:tabs>
+        <w:spacing w:after="0" w:line="240" w:lineRule="auto"/>
+        <w:rPr>
+          <w:rFonts w:ascii="Arial" w:eastAsia="Arial" w:hAnsi="Arial" w:cs="Arial"/>
+          <w:sz w:val="20"/>
+          <w:szCs w:val="20"/>
+        </w:rPr>
+      </w:pPr>
+    </w:p>
+    <w:p>
+      <w:pPr>
+        <w:tabs>
+          <w:tab w:val="left" w:pos="720"/>
+          <w:tab w:val="left" w:pos="1440"/>
+          <w:tab w:val="left" w:pos="2160"/>
+          <w:tab w:val="left" w:pos="2880"/>
+          <w:tab w:val="left" w:pos="3600"/>
+          <w:tab w:val="left" w:pos="4320"/>
+          <w:tab w:val="left" w:pos="5040"/>
+          <w:tab w:val="left" w:pos="5760"/>
+          <w:tab w:val="left" w:pos="6480"/>
+          <w:tab w:val="left" w:pos="7200"/>
+          <w:tab w:val="left" w:pos="7920"/>
+          <w:tab w:val="left" w:pos="8640"/>
+          <w:tab w:val="left" w:pos="9360"/>
+          <w:tab w:val="left" w:pos="10080"/>
+        </w:tabs>
+        <w:spacing w:after="0" w:line="240" w:lineRule="auto"/>
+        <w:rPr>
+          <w:rFonts w:ascii="Arial" w:eastAsia="Arial" w:hAnsi="Arial" w:cs="Arial"/>
+          <w:sz w:val="20"/>
+          <w:szCs w:val="20"/>
+        </w:rPr>
+      </w:pPr>
+      <w:r>
+        <w:rPr>
+          <w:rFonts w:ascii="Arial" w:eastAsia="Arial" w:hAnsi="Arial" w:cs="Arial"/>
+          <w:i/>
+          <w:sz w:val="20"/>
+          <w:szCs w:val="20"/>
+          <w:u w:val="single"/>
+        </w:rPr>
+        <w:t xml:space="preserve">Right Atrium: </w:t>
+      </w:r>
+      <w:r>
+        <w:rPr>
+          <w:rFonts w:ascii="Arial" w:eastAsia="Arial" w:hAnsi="Arial" w:cs="Arial"/>
+          <w:sz w:val="20"/>
+          <w:szCs w:val="20"/>
+        </w:rPr>
+        <w:t>size assessment Not provided in source export.</w:t>
       </w:r>
     </w:p>
     <w:p>
@@ -708,7 +1001,36 @@
         </w:rPr>
       </w:pPr>
       <w:r>
-        <w:t>Left Ventricle: Normal LV volumes and systolic function (EF 61.4%). No LV hypertrophy. Maximum LV wall thickness is 11.75 mm in end-diastole. Normal LV mass (92.5 g).</w:t>
+        <w:rPr>
+          <w:rFonts w:ascii="Arial" w:hAnsi="Arial" w:cs="Arial"/>
+          <w:i/>
+          <w:sz w:val="20"/>
+          <w:szCs w:val="20"/>
+          <w:u w:val="single"/>
+        </w:rPr>
+        <w:t xml:space="preserve">Left Ventricle: </w:t>
+      </w:r>
+      <w:r>
+        <w:rPr>
+          <w:rFonts w:ascii="Arial" w:hAnsi="Arial" w:cs="Arial"/>
+          <w:sz w:val="20"/>
+          <w:szCs w:val="20"/>
+        </w:rPr>
+        <w:t>LV volumes and systolic function: EF 61.4 %; EDV 148.8 mL; ESV 57.5 mL; LV hypertrophy: cannot be assessed from the measurements provided; maximum LV wall thickness: 11.7 mm; LV mass: 92.5 g.</w:t>
+      </w:r>
+      <w:r>
+        <w:rPr>
+          <w:rFonts w:ascii="Arial" w:hAnsi="Arial" w:cs="Arial"/>
+          <w:sz w:val="20"/>
+          <w:szCs w:val="20"/>
+        </w:rPr>
+      </w:r>
+      <w:r>
+        <w:rPr>
+          <w:rFonts w:ascii="Arial" w:hAnsi="Arial" w:cs="Arial"/>
+          <w:sz w:val="20"/>
+          <w:szCs w:val="20"/>
+        </w:rPr>
       </w:r>
     </w:p>
     <w:p>
@@ -769,7 +1091,36 @@
         </w:rPr>
       </w:pPr>
       <w:r>
-        <w:t>Right Ventricle: Normal RV volumes and systolic function (EF 63.2%).</w:t>
+        <w:rPr>
+          <w:rFonts w:ascii="Arial" w:hAnsi="Arial" w:cs="Arial"/>
+          <w:i/>
+          <w:sz w:val="20"/>
+          <w:szCs w:val="20"/>
+          <w:u w:val="single"/>
+        </w:rPr>
+        <w:t xml:space="preserve">Right Ventricle: </w:t>
+      </w:r>
+      <w:r>
+        <w:rPr>
+          <w:rFonts w:ascii="Arial" w:hAnsi="Arial" w:cs="Arial"/>
+          <w:sz w:val="20"/>
+          <w:szCs w:val="20"/>
+        </w:rPr>
+        <w:t>EF 63.2 %; EDV 146.0 mL; ESV 53.7 mL.</w:t>
+      </w:r>
+      <w:r>
+        <w:rPr>
+          <w:rFonts w:ascii="Arial" w:hAnsi="Arial" w:cs="Arial"/>
+          <w:sz w:val="20"/>
+          <w:szCs w:val="20"/>
+        </w:rPr>
+      </w:r>
+      <w:r>
+        <w:rPr>
+          <w:rFonts w:ascii="Arial" w:hAnsi="Arial" w:cs="Arial"/>
+          <w:sz w:val="20"/>
+          <w:szCs w:val="20"/>
+        </w:rPr>
       </w:r>
     </w:p>
     <w:p>
@@ -830,7 +1181,22 @@
         </w:rPr>
       </w:pPr>
       <w:r>
-        <w:t>Aortic Valve: Normal appearances and function.</w:t>
+        <w:rPr>
+          <w:rFonts w:ascii="Arial" w:hAnsi="Arial" w:cs="Arial"/>
+          <w:i/>
+          <w:sz w:val="20"/>
+          <w:szCs w:val="20"/>
+          <w:u w:val="single"/>
+        </w:rPr>
+        <w:t xml:space="preserve">Aortic Valve: </w:t>
+      </w:r>
+      <w:r>
+        <w:rPr>
+          <w:rFonts w:ascii="Arial" w:hAnsi="Arial" w:cs="Arial"/>
+          <w:sz w:val="20"/>
+          <w:szCs w:val="20"/>
+        </w:rPr>
+        <w:t>assessment Not provided in source export.</w:t>
       </w:r>
     </w:p>
     <w:p>
@@ -891,7 +1257,22 @@
         </w:rPr>
       </w:pPr>
       <w:r>
-        <w:t>Pulmonary Valve: Normal appearances and function.</w:t>
+        <w:rPr>
+          <w:rFonts w:ascii="Arial" w:hAnsi="Arial" w:cs="Arial"/>
+          <w:i/>
+          <w:sz w:val="20"/>
+          <w:szCs w:val="20"/>
+          <w:u w:val="single"/>
+        </w:rPr>
+        <w:t xml:space="preserve">Pulmonary Valve: </w:t>
+      </w:r>
+      <w:r>
+        <w:rPr>
+          <w:rFonts w:ascii="Arial" w:hAnsi="Arial" w:cs="Arial"/>
+          <w:sz w:val="20"/>
+          <w:szCs w:val="20"/>
+        </w:rPr>
+        <w:t>assessment Not provided in source export.</w:t>
       </w:r>
     </w:p>
     <w:p>
@@ -952,7 +1333,22 @@
         </w:rPr>
       </w:pPr>
       <w:r>
-        <w:t>Mitral Valve: Normal appearances and function.</w:t>
+        <w:rPr>
+          <w:rFonts w:ascii="Arial" w:hAnsi="Arial" w:cs="Arial"/>
+          <w:i/>
+          <w:sz w:val="20"/>
+          <w:szCs w:val="20"/>
+          <w:u w:val="single"/>
+        </w:rPr>
+        <w:t xml:space="preserve">Mitral Valve: </w:t>
+      </w:r>
+      <w:r>
+        <w:rPr>
+          <w:rFonts w:ascii="Arial" w:hAnsi="Arial" w:cs="Arial"/>
+          <w:sz w:val="20"/>
+          <w:szCs w:val="20"/>
+        </w:rPr>
+        <w:t>assessment Not provided in source export.</w:t>
       </w:r>
     </w:p>
     <w:p>
@@ -1013,7 +1409,22 @@
         </w:rPr>
       </w:pPr>
       <w:r>
-        <w:t>Tricuspid Valve: Normal appearances and function.</w:t>
+        <w:rPr>
+          <w:rFonts w:ascii="Arial" w:hAnsi="Arial" w:cs="Arial"/>
+          <w:i/>
+          <w:sz w:val="20"/>
+          <w:szCs w:val="20"/>
+          <w:u w:val="single"/>
+        </w:rPr>
+        <w:t xml:space="preserve">Tricuspid Valve: </w:t>
+      </w:r>
+      <w:r>
+        <w:rPr>
+          <w:rFonts w:ascii="Arial" w:hAnsi="Arial" w:cs="Arial"/>
+          <w:sz w:val="20"/>
+          <w:szCs w:val="20"/>
+        </w:rPr>
+        <w:t>assessment Not provided in source export.</w:t>
       </w:r>
     </w:p>
     <w:p>
@@ -1074,64 +1485,196 @@
         </w:rPr>
       </w:pPr>
       <w:r>
-        <w:t>Pericardium: No effusion or thickening.</w:t>
-      </w:r>
-    </w:p>
-    <w:p>
-      <w:pPr>
-        <w:tabs>
-          <w:tab w:val="left" w:pos="720"/>
-          <w:tab w:val="left" w:pos="1440"/>
-          <w:tab w:val="left" w:pos="2160"/>
-          <w:tab w:val="left" w:pos="2880"/>
-          <w:tab w:val="left" w:pos="3600"/>
-          <w:tab w:val="left" w:pos="4320"/>
-          <w:tab w:val="left" w:pos="5040"/>
-          <w:tab w:val="left" w:pos="5760"/>
-          <w:tab w:val="left" w:pos="6480"/>
-          <w:tab w:val="left" w:pos="7200"/>
-          <w:tab w:val="left" w:pos="7920"/>
-          <w:tab w:val="left" w:pos="8640"/>
-          <w:tab w:val="left" w:pos="9360"/>
-          <w:tab w:val="left" w:pos="10080"/>
-        </w:tabs>
-        <w:spacing w:after="0" w:line="240" w:lineRule="auto"/>
-        <w:rPr>
-          <w:rFonts w:ascii="Arial" w:eastAsia="Arial" w:hAnsi="Arial" w:cs="Arial"/>
+        <w:rPr>
+          <w:rFonts w:ascii="Arial" w:hAnsi="Arial" w:cs="Arial"/>
           <w:i/>
           <w:sz w:val="20"/>
           <w:szCs w:val="20"/>
           <w:u w:val="single"/>
         </w:rPr>
-      </w:pPr>
-    </w:p>
-    <w:p>
-      <w:pPr>
-        <w:tabs>
-          <w:tab w:val="left" w:pos="720"/>
-          <w:tab w:val="left" w:pos="1440"/>
-          <w:tab w:val="left" w:pos="2160"/>
-          <w:tab w:val="left" w:pos="2880"/>
-          <w:tab w:val="left" w:pos="3600"/>
-          <w:tab w:val="left" w:pos="4320"/>
-          <w:tab w:val="left" w:pos="5040"/>
-          <w:tab w:val="left" w:pos="5760"/>
-          <w:tab w:val="left" w:pos="6480"/>
-          <w:tab w:val="left" w:pos="7200"/>
-          <w:tab w:val="left" w:pos="7920"/>
-          <w:tab w:val="left" w:pos="8640"/>
-          <w:tab w:val="left" w:pos="9360"/>
-          <w:tab w:val="left" w:pos="10080"/>
-        </w:tabs>
-        <w:spacing w:after="0" w:line="240" w:lineRule="auto"/>
-        <w:rPr>
-          <w:rFonts w:ascii="Arial" w:eastAsia="Arial" w:hAnsi="Arial" w:cs="Arial"/>
-          <w:sz w:val="20"/>
-          <w:szCs w:val="20"/>
-        </w:rPr>
-      </w:pPr>
-      <w:r>
-        <w:t>Oedema Imaging (T2 Mapping/T2 STIR): No oedema. Normal native T2 value.</w:t>
+        <w:t xml:space="preserve">Pericardium: </w:t>
+      </w:r>
+      <w:r>
+        <w:rPr>
+          <w:rFonts w:ascii="Arial" w:hAnsi="Arial" w:cs="Arial"/>
+          <w:sz w:val="20"/>
+          <w:szCs w:val="20"/>
+        </w:rPr>
+        <w:t>assessment Not provided in source export.</w:t>
+      </w:r>
+    </w:p>
+    <w:p>
+      <w:pPr>
+        <w:tabs>
+          <w:tab w:val="left" w:pos="720"/>
+          <w:tab w:val="left" w:pos="1440"/>
+          <w:tab w:val="left" w:pos="2160"/>
+          <w:tab w:val="left" w:pos="2880"/>
+          <w:tab w:val="left" w:pos="3600"/>
+          <w:tab w:val="left" w:pos="4320"/>
+          <w:tab w:val="left" w:pos="5040"/>
+          <w:tab w:val="left" w:pos="5760"/>
+          <w:tab w:val="left" w:pos="6480"/>
+          <w:tab w:val="left" w:pos="7200"/>
+          <w:tab w:val="left" w:pos="7920"/>
+          <w:tab w:val="left" w:pos="8640"/>
+          <w:tab w:val="left" w:pos="9360"/>
+          <w:tab w:val="left" w:pos="10080"/>
+        </w:tabs>
+        <w:spacing w:after="0" w:line="240" w:lineRule="auto"/>
+        <w:rPr>
+          <w:rFonts w:ascii="Arial" w:eastAsia="Arial" w:hAnsi="Arial" w:cs="Arial"/>
+          <w:i/>
+          <w:sz w:val="20"/>
+          <w:szCs w:val="20"/>
+          <w:u w:val="single"/>
+        </w:rPr>
+      </w:pPr>
+    </w:p>
+    <w:p>
+      <w:pPr>
+        <w:tabs>
+          <w:tab w:val="left" w:pos="720"/>
+          <w:tab w:val="left" w:pos="1440"/>
+          <w:tab w:val="left" w:pos="2160"/>
+          <w:tab w:val="left" w:pos="2880"/>
+          <w:tab w:val="left" w:pos="3600"/>
+          <w:tab w:val="left" w:pos="4320"/>
+          <w:tab w:val="left" w:pos="5040"/>
+          <w:tab w:val="left" w:pos="5760"/>
+          <w:tab w:val="left" w:pos="6480"/>
+          <w:tab w:val="left" w:pos="7200"/>
+          <w:tab w:val="left" w:pos="7920"/>
+          <w:tab w:val="left" w:pos="8640"/>
+          <w:tab w:val="left" w:pos="9360"/>
+          <w:tab w:val="left" w:pos="10080"/>
+        </w:tabs>
+        <w:spacing w:after="0" w:line="240" w:lineRule="auto"/>
+        <w:rPr>
+          <w:rFonts w:ascii="Arial" w:eastAsia="Arial" w:hAnsi="Arial" w:cs="Arial"/>
+          <w:sz w:val="20"/>
+          <w:szCs w:val="20"/>
+        </w:rPr>
+      </w:pPr>
+      <w:proofErr w:type="spellStart"/>
+      <w:r>
+        <w:rPr>
+          <w:rFonts w:ascii="Arial" w:eastAsia="Arial" w:hAnsi="Arial" w:cs="Arial"/>
+          <w:i/>
+          <w:sz w:val="20"/>
+          <w:szCs w:val="20"/>
+          <w:u w:val="single"/>
+        </w:rPr>
+        <w:t xml:space="preserve">Oedema Imaging (T2 Mapping/T2 STIR): </w:t>
+      </w:r>
+      <w:proofErr w:type="spellEnd"/>
+      <w:r>
+        <w:rPr>
+          <w:rFonts w:ascii="Arial" w:eastAsia="Arial" w:hAnsi="Arial" w:cs="Arial"/>
+          <w:i/>
+          <w:sz w:val="20"/>
+          <w:szCs w:val="20"/>
+          <w:u w:val="single"/>
+        </w:rPr>
+        <w:t>Not provided in source export.</w:t>
+      </w:r>
+      <w:r>
+        <w:rPr>
+          <w:rFonts w:ascii="Arial" w:eastAsia="Arial" w:hAnsi="Arial" w:cs="Arial"/>
+          <w:i/>
+          <w:sz w:val="20"/>
+          <w:szCs w:val="20"/>
+          <w:u w:val="single"/>
+        </w:rPr>
+      </w:r>
+      <w:r>
+        <w:rPr>
+          <w:rFonts w:ascii="Arial" w:eastAsia="Arial" w:hAnsi="Arial" w:cs="Arial"/>
+          <w:i/>
+          <w:sz w:val="20"/>
+          <w:szCs w:val="20"/>
+          <w:u w:val="single"/>
+        </w:rPr>
+      </w:r>
+      <w:r>
+        <w:rPr>
+          <w:rFonts w:ascii="Arial" w:eastAsia="Arial" w:hAnsi="Arial" w:cs="Arial"/>
+          <w:i/>
+          <w:sz w:val="20"/>
+          <w:szCs w:val="20"/>
+          <w:u w:val="single"/>
+        </w:rPr>
+      </w:r>
+      <w:r>
+        <w:rPr>
+          <w:rFonts w:ascii="Arial" w:eastAsia="Arial" w:hAnsi="Arial" w:cs="Arial"/>
+          <w:i/>
+          <w:sz w:val="20"/>
+          <w:szCs w:val="20"/>
+          <w:u w:val="single"/>
+        </w:rPr>
+      </w:r>
+      <w:r>
+        <w:rPr>
+          <w:rFonts w:ascii="Arial" w:eastAsia="Arial" w:hAnsi="Arial" w:cs="Arial"/>
+          <w:i/>
+          <w:sz w:val="20"/>
+          <w:szCs w:val="20"/>
+          <w:u w:val="single"/>
+        </w:rPr>
+      </w:r>
+      <w:r>
+        <w:rPr>
+          <w:rFonts w:ascii="Arial" w:eastAsia="Arial" w:hAnsi="Arial" w:cs="Arial"/>
+          <w:i/>
+          <w:sz w:val="20"/>
+          <w:szCs w:val="20"/>
+          <w:u w:val="single"/>
+        </w:rPr>
+      </w:r>
+      <w:r>
+        <w:rPr>
+          <w:rFonts w:ascii="Arial" w:eastAsia="Arial" w:hAnsi="Arial" w:cs="Arial"/>
+          <w:sz w:val="20"/>
+          <w:szCs w:val="20"/>
+        </w:rPr>
+      </w:r>
+      <w:proofErr w:type="spellStart"/>
+      <w:r>
+        <w:rPr>
+          <w:rFonts w:ascii="Arial" w:eastAsia="Arial" w:hAnsi="Arial" w:cs="Arial"/>
+          <w:sz w:val="20"/>
+          <w:szCs w:val="20"/>
+        </w:rPr>
+      </w:r>
+      <w:proofErr w:type="spellEnd"/>
+      <w:r>
+        <w:rPr>
+          <w:rFonts w:ascii="Arial" w:eastAsia="Arial" w:hAnsi="Arial" w:cs="Arial"/>
+          <w:sz w:val="20"/>
+          <w:szCs w:val="20"/>
+        </w:rPr>
+      </w:r>
+      <w:r>
+        <w:rPr>
+          <w:rFonts w:ascii="Arial" w:eastAsia="Arial" w:hAnsi="Arial" w:cs="Arial"/>
+          <w:sz w:val="20"/>
+          <w:szCs w:val="20"/>
+        </w:rPr>
+      </w:r>
+      <w:r>
+        <w:rPr>
+          <w:rFonts w:ascii="Arial" w:eastAsia="Arial" w:hAnsi="Arial" w:cs="Arial"/>
+          <w:sz w:val="20"/>
+          <w:szCs w:val="20"/>
+        </w:rPr>
+      </w:r>
+      <w:r>
+        <w:rPr>
+          <w:rFonts w:ascii="Arial" w:eastAsia="Arial" w:hAnsi="Arial" w:cs="Arial"/>
+          <w:sz w:val="20"/>
+          <w:szCs w:val="20"/>
+        </w:rPr>
       </w:r>
     </w:p>
     <w:p>
@@ -1189,7 +1732,63 @@
         </w:rPr>
       </w:pPr>
       <w:r>
-        <w:t>Late Gadolinium Enhancement (LGE/T1 Mapping): No LGE or infarct. Normal native T1 value.</w:t>
+        <w:rPr>
+          <w:rFonts w:ascii="Arial" w:hAnsi="Arial" w:cs="Arial"/>
+          <w:i/>
+          <w:sz w:val="20"/>
+          <w:szCs w:val="20"/>
+          <w:u w:val="single"/>
+        </w:rPr>
+        <w:t xml:space="preserve">Late Gadolinium Enhancement (LGE/T1 Mapping): </w:t>
+      </w:r>
+      <w:r>
+        <w:rPr>
+          <w:rFonts w:ascii="Arial" w:hAnsi="Arial" w:cs="Arial"/>
+          <w:i/>
+          <w:sz w:val="20"/>
+          <w:szCs w:val="20"/>
+          <w:u w:val="single"/>
+        </w:rPr>
+        <w:t>Not provided in source export.</w:t>
+      </w:r>
+      <w:r>
+        <w:rPr>
+          <w:rFonts w:ascii="Arial" w:hAnsi="Arial" w:cs="Arial"/>
+          <w:i/>
+          <w:sz w:val="20"/>
+          <w:szCs w:val="20"/>
+          <w:u w:val="single"/>
+        </w:rPr>
+      </w:r>
+      <w:r>
+        <w:rPr>
+          <w:rFonts w:ascii="Arial" w:hAnsi="Arial" w:cs="Arial"/>
+          <w:i/>
+          <w:sz w:val="20"/>
+          <w:szCs w:val="20"/>
+          <w:u w:val="single"/>
+        </w:rPr>
+      </w:r>
+      <w:r>
+        <w:rPr>
+          <w:rFonts w:ascii="Arial" w:hAnsi="Arial" w:cs="Arial"/>
+          <w:sz w:val="20"/>
+          <w:szCs w:val="20"/>
+        </w:rPr>
+      </w:r>
+      <w:r>
+        <w:rPr>
+          <w:rFonts w:ascii="Arial" w:eastAsia="Arial" w:hAnsi="Arial" w:cs="Arial"/>
+          <w:sz w:val="20"/>
+          <w:szCs w:val="20"/>
+        </w:rPr>
+      </w:r>
+      <w:r>
+        <w:rPr>
+          <w:rFonts w:ascii="Arial" w:eastAsia="Arial" w:hAnsi="Arial" w:cs="Arial"/>
+          <w:sz w:val="20"/>
+          <w:szCs w:val="20"/>
+        </w:rPr>
       </w:r>
     </w:p>
     <w:p>
@@ -1250,7 +1849,29 @@
         </w:rPr>
       </w:pPr>
       <w:r>
-        <w:t>Extracardiac: Nil</w:t>
+        <w:rPr>
+          <w:rFonts w:ascii="Arial" w:hAnsi="Arial" w:cs="Arial"/>
+          <w:i/>
+          <w:sz w:val="20"/>
+          <w:szCs w:val="20"/>
+          <w:u w:val="single"/>
+        </w:rPr>
+        <w:t xml:space="preserve">Extracardiac: </w:t>
+      </w:r>
+      <w:r>
+        <w:rPr>
+          <w:rFonts w:ascii="Arial" w:hAnsi="Arial" w:cs="Arial"/>
+          <w:sz w:val="20"/>
+          <w:szCs w:val="20"/>
+        </w:rPr>
+        <w:t>assessment Not provided in source export.</w:t>
+      </w:r>
+      <w:r>
+        <w:rPr>
+          <w:rFonts w:ascii="Arial" w:hAnsi="Arial" w:cs="Arial"/>
+          <w:sz w:val="20"/>
+          <w:szCs w:val="20"/>
+        </w:rPr>
       </w:r>
     </w:p>
     <w:p>
@@ -1354,7 +1975,40 @@
         </w:rPr>
       </w:pPr>
       <w:r>
-        <w:t>Normal LV &amp; RV volumes and systolic function.</w:t>
+        <w:rPr>
+          <w:rFonts w:ascii="Arial" w:eastAsia="Arial" w:hAnsi="Arial" w:cs="Arial"/>
+          <w:sz w:val="20"/>
+          <w:szCs w:val="20"/>
+        </w:rPr>
+        <w:t>LV EF 61.4 %; RV EF 63.2 %</w:t>
+      </w:r>
+      <w:r>
+        <w:rPr>
+          <w:rFonts w:ascii="Arial" w:eastAsia="Arial" w:hAnsi="Arial" w:cs="Arial"/>
+          <w:sz w:val="20"/>
+          <w:szCs w:val="20"/>
+        </w:rPr>
+      </w:r>
+      <w:r>
+        <w:rPr>
+          <w:rFonts w:ascii="Arial" w:hAnsi="Arial" w:cs="Arial"/>
+          <w:sz w:val="20"/>
+          <w:szCs w:val="20"/>
+        </w:rPr>
+      </w:r>
+      <w:r>
+        <w:rPr>
+          <w:rFonts w:ascii="Arial" w:hAnsi="Arial" w:cs="Arial"/>
+          <w:sz w:val="20"/>
+          <w:szCs w:val="20"/>
+        </w:rPr>
+      </w:r>
+      <w:r>
+        <w:rPr>
+          <w:rFonts w:ascii="Arial" w:hAnsi="Arial" w:cs="Arial"/>
+          <w:sz w:val="20"/>
+          <w:szCs w:val="20"/>
+        </w:rPr>
       </w:r>
     </w:p>
     <w:p>
@@ -1393,8 +2047,29 @@
         </w:rPr>
       </w:pPr>
       <w:r>
-        <w:t>No LGE or infarct.</w:t>
-      </w:r>
+        <w:rPr>
+          <w:rFonts w:ascii="Arial" w:hAnsi="Arial" w:cs="Arial"/>
+          <w:sz w:val="20"/>
+          <w:szCs w:val="20"/>
+        </w:rPr>
+        <w:t>LGE or infarct assessment not reported in source export.</w:t>
+      </w:r>
+      <w:r>
+        <w:rPr>
+          <w:rFonts w:ascii="Arial" w:hAnsi="Arial" w:cs="Arial"/>
+          <w:sz w:val="20"/>
+          <w:szCs w:val="20"/>
+        </w:rPr>
+      </w:r>
+      <w:r>
+        <w:rPr>
+          <w:rFonts w:ascii="Arial" w:hAnsi="Arial" w:cs="Arial"/>
+          <w:sz w:val="20"/>
+          <w:szCs w:val="20"/>
+        </w:rPr>
+      </w:r>
+      <w:bookmarkStart w:id="2" w:name="_GoBack"/>
+      <w:bookmarkEnd w:id="2"/>
     </w:p>
     <w:p>
       <w:pPr>
@@ -1464,6 +2139,9 @@
               </w:rPr>
               <w:t xml:space="preserve">Height: </w:t>
             </w:r>
+            <w:r>
+              <w:t>Not provided</w:t>
+            </w:r>
           </w:p>
         </w:tc>
         <w:tc>
@@ -1477,8 +2155,37 @@
             </w:tcBorders>
           </w:tcPr>
           <w:p>
+            <w:pPr>
+              <w:tabs>
+                <w:tab w:val="left" w:pos="720"/>
+                <w:tab w:val="left" w:pos="1440"/>
+                <w:tab w:val="left" w:pos="2160"/>
+                <w:tab w:val="left" w:pos="2880"/>
+                <w:tab w:val="left" w:pos="3600"/>
+                <w:tab w:val="left" w:pos="4320"/>
+                <w:tab w:val="left" w:pos="5040"/>
+                <w:tab w:val="left" w:pos="5760"/>
+                <w:tab w:val="left" w:pos="6480"/>
+                <w:tab w:val="left" w:pos="7200"/>
+                <w:tab w:val="left" w:pos="7920"/>
+                <w:tab w:val="left" w:pos="8640"/>
+                <w:tab w:val="left" w:pos="9360"/>
+                <w:tab w:val="left" w:pos="10080"/>
+              </w:tabs>
+              <w:spacing w:after="0" w:line="240" w:lineRule="auto"/>
+              <w:rPr>
+                <w:rFonts w:ascii="Arial" w:eastAsia="Arial" w:hAnsi="Arial" w:cs="Arial"/>
+                <w:sz w:val="20"/>
+                <w:szCs w:val="20"/>
+              </w:rPr>
+            </w:pPr>
             <w:r>
-              <w:t>170 cm</w:t>
+              <w:rPr>
+                <w:rFonts w:ascii="Arial" w:eastAsia="Arial" w:hAnsi="Arial" w:cs="Arial"/>
+                <w:sz w:val="20"/>
+                <w:szCs w:val="20"/>
+              </w:rPr>
+              <w:t>cm</w:t>
             </w:r>
           </w:p>
         </w:tc>
@@ -1525,7 +2232,10 @@
                 <w:sz w:val="20"/>
                 <w:szCs w:val="20"/>
               </w:rPr>
-              <w:t>Weight:</w:t>
+              <w:t xml:space="preserve">Weight: </w:t>
+            </w:r>
+            <w:r>
+              <w:t>Not provided</w:t>
             </w:r>
           </w:p>
         </w:tc>
@@ -1540,8 +2250,37 @@
             </w:tcBorders>
           </w:tcPr>
           <w:p>
+            <w:pPr>
+              <w:tabs>
+                <w:tab w:val="left" w:pos="720"/>
+                <w:tab w:val="left" w:pos="1440"/>
+                <w:tab w:val="left" w:pos="2160"/>
+                <w:tab w:val="left" w:pos="2880"/>
+                <w:tab w:val="left" w:pos="3600"/>
+                <w:tab w:val="left" w:pos="4320"/>
+                <w:tab w:val="left" w:pos="5040"/>
+                <w:tab w:val="left" w:pos="5760"/>
+                <w:tab w:val="left" w:pos="6480"/>
+                <w:tab w:val="left" w:pos="7200"/>
+                <w:tab w:val="left" w:pos="7920"/>
+                <w:tab w:val="left" w:pos="8640"/>
+                <w:tab w:val="left" w:pos="9360"/>
+                <w:tab w:val="left" w:pos="10080"/>
+              </w:tabs>
+              <w:spacing w:after="0" w:line="240" w:lineRule="auto"/>
+              <w:rPr>
+                <w:rFonts w:ascii="Arial" w:eastAsia="Arial" w:hAnsi="Arial" w:cs="Arial"/>
+                <w:sz w:val="20"/>
+                <w:szCs w:val="20"/>
+              </w:rPr>
+            </w:pPr>
             <w:r>
-              <w:t>48.6 kg</w:t>
+              <w:rPr>
+                <w:rFonts w:ascii="Arial" w:eastAsia="Arial" w:hAnsi="Arial" w:cs="Arial"/>
+                <w:sz w:val="20"/>
+                <w:szCs w:val="20"/>
+              </w:rPr>
+              <w:t>kg</w:t>
             </w:r>
           </w:p>
         </w:tc>
@@ -1588,7 +2327,10 @@
                 <w:sz w:val="20"/>
                 <w:szCs w:val="20"/>
               </w:rPr>
-              <w:t>BSA:</w:t>
+              <w:t xml:space="preserve">BSA: </w:t>
+            </w:r>
+            <w:r>
+              <w:t>1.52 (derived)</w:t>
             </w:r>
           </w:p>
         </w:tc>
@@ -1603,8 +2345,46 @@
             </w:tcBorders>
           </w:tcPr>
           <w:p>
+            <w:pPr>
+              <w:tabs>
+                <w:tab w:val="left" w:pos="720"/>
+                <w:tab w:val="left" w:pos="1440"/>
+                <w:tab w:val="left" w:pos="2160"/>
+                <w:tab w:val="left" w:pos="2880"/>
+                <w:tab w:val="left" w:pos="3600"/>
+                <w:tab w:val="left" w:pos="4320"/>
+                <w:tab w:val="left" w:pos="5040"/>
+                <w:tab w:val="left" w:pos="5760"/>
+                <w:tab w:val="left" w:pos="6480"/>
+                <w:tab w:val="left" w:pos="7200"/>
+                <w:tab w:val="left" w:pos="7920"/>
+                <w:tab w:val="left" w:pos="8640"/>
+                <w:tab w:val="left" w:pos="9360"/>
+                <w:tab w:val="left" w:pos="10080"/>
+              </w:tabs>
+              <w:spacing w:after="0" w:line="240" w:lineRule="auto"/>
+              <w:rPr>
+                <w:rFonts w:ascii="Arial" w:eastAsia="Arial" w:hAnsi="Arial" w:cs="Arial"/>
+                <w:sz w:val="20"/>
+                <w:szCs w:val="20"/>
+              </w:rPr>
+            </w:pPr>
             <w:r>
-              <w:t>1.52 m2</w:t>
+              <w:rPr>
+                <w:rFonts w:ascii="Arial" w:eastAsia="Arial" w:hAnsi="Arial" w:cs="Arial"/>
+                <w:sz w:val="20"/>
+                <w:szCs w:val="20"/>
+              </w:rPr>
+              <w:t>m</w:t>
+            </w:r>
+            <w:r>
+              <w:rPr>
+                <w:rFonts w:ascii="Arial" w:eastAsia="Arial" w:hAnsi="Arial" w:cs="Arial"/>
+                <w:sz w:val="20"/>
+                <w:szCs w:val="20"/>
+                <w:vertAlign w:val="superscript"/>
+              </w:rPr>
+              <w:t>2</w:t>
             </w:r>
           </w:p>
         </w:tc>

</xml_diff>

<commit_message>
Classify supported CMR template measurements
Co-authored-by: Copilot App <223556219+Copilot@users.noreply.github.com>
</commit_message>
<xml_diff>
--- a/AI_agent/CMR_Non_Stress_Report_Final.docx
+++ b/AI_agent/CMR_Non_Stress_Report_Final.docx
@@ -126,15 +126,15 @@
           <w:sz w:val="20"/>
           <w:szCs w:val="20"/>
         </w:rPr>
-        <w:t xml:space="preserve">CLINICAL HISTORY: </w:t>
-      </w:r>
-      <w:r>
-        <w:rPr>
-          <w:rFonts w:ascii="Arial" w:eastAsia="Arial" w:hAnsi="Arial" w:cs="Arial"/>
-          <w:sz w:val="20"/>
-          <w:szCs w:val="20"/>
-        </w:rPr>
-        <w:t>Not provided in source export.</w:t>
+        <w:t>CLINICAL HISTORY:</w:t>
+      </w:r>
+      <w:r>
+        <w:rPr>
+          <w:rFonts w:ascii="Arial" w:eastAsia="Arial" w:hAnsi="Arial" w:cs="Arial"/>
+          <w:sz w:val="20"/>
+          <w:szCs w:val="20"/>
+        </w:rPr>
+        <w:t xml:space="preserve"> []</w:t>
       </w:r>
     </w:p>
     <w:p>
@@ -290,21 +290,23 @@
           <w:sz w:val="20"/>
           <w:szCs w:val="20"/>
         </w:rPr>
-        <w:t>Not provided in source export.</w:t>
-      </w:r>
-      <w:r>
-        <w:rPr>
-          <w:rFonts w:ascii="Arial" w:eastAsia="Arial" w:hAnsi="Arial" w:cs="Arial"/>
-          <w:sz w:val="20"/>
-          <w:szCs w:val="20"/>
-        </w:rPr>
-      </w:r>
-      <w:r>
-        <w:rPr>
-          <w:rFonts w:ascii="Arial" w:eastAsia="Arial" w:hAnsi="Arial" w:cs="Arial"/>
-          <w:sz w:val="20"/>
-          <w:szCs w:val="20"/>
-        </w:rPr>
+        <w:t>Siemens</w:t>
+      </w:r>
+      <w:r>
+        <w:rPr>
+          <w:rFonts w:ascii="Arial" w:eastAsia="Arial" w:hAnsi="Arial" w:cs="Arial"/>
+          <w:sz w:val="20"/>
+          <w:szCs w:val="20"/>
+        </w:rPr>
+        <w:t xml:space="preserve"> 3T</w:t>
+      </w:r>
+      <w:r>
+        <w:rPr>
+          <w:rFonts w:ascii="Arial" w:eastAsia="Arial" w:hAnsi="Arial" w:cs="Arial"/>
+          <w:sz w:val="20"/>
+          <w:szCs w:val="20"/>
+        </w:rPr>
+        <w:t xml:space="preserve"> </w:t>
       </w:r>
       <w:proofErr w:type="spellStart"/>
       <w:r>
@@ -313,6 +315,7 @@
           <w:sz w:val="20"/>
           <w:szCs w:val="20"/>
         </w:rPr>
+        <w:t>Magnetom</w:t>
       </w:r>
       <w:proofErr w:type="spellEnd"/>
       <w:r>
@@ -321,13 +324,15 @@
           <w:sz w:val="20"/>
           <w:szCs w:val="20"/>
         </w:rPr>
-      </w:r>
-      <w:r>
-        <w:rPr>
-          <w:rFonts w:ascii="Arial" w:hAnsi="Arial" w:cs="Arial"/>
-          <w:sz w:val="20"/>
-          <w:szCs w:val="20"/>
-        </w:rPr>
+        <w:t xml:space="preserve"> Vida. [GE Signa Premier 3T.]</w:t>
+      </w:r>
+      <w:r>
+        <w:rPr>
+          <w:rFonts w:ascii="Arial" w:hAnsi="Arial" w:cs="Arial"/>
+          <w:sz w:val="20"/>
+          <w:szCs w:val="20"/>
+        </w:rPr>
+        <w:t xml:space="preserve"> </w:t>
       </w:r>
     </w:p>
     <w:p>
@@ -423,35 +428,39 @@
           <w:sz w:val="20"/>
           <w:szCs w:val="20"/>
         </w:rPr>
-        <w:t>Comparison with previous cardiac MRI: Not provided in source export.</w:t>
-      </w:r>
-      <w:r>
-        <w:rPr>
-          <w:rFonts w:ascii="Arial" w:eastAsia="Arial" w:hAnsi="Arial" w:cs="Arial"/>
-          <w:sz w:val="20"/>
-          <w:szCs w:val="20"/>
-        </w:rPr>
-      </w:r>
-      <w:r>
-        <w:rPr>
-          <w:rFonts w:ascii="Arial" w:hAnsi="Arial" w:cs="Arial"/>
-          <w:sz w:val="20"/>
-          <w:szCs w:val="20"/>
-        </w:rPr>
-      </w:r>
-      <w:r>
-        <w:rPr>
-          <w:rFonts w:ascii="Arial" w:hAnsi="Arial" w:cs="Arial"/>
-          <w:sz w:val="20"/>
-          <w:szCs w:val="20"/>
-        </w:rPr>
-      </w:r>
-      <w:r>
-        <w:rPr>
-          <w:rFonts w:ascii="Arial" w:hAnsi="Arial" w:cs="Arial"/>
-          <w:sz w:val="20"/>
-          <w:szCs w:val="20"/>
-        </w:rPr>
+        <w:t>[] previous cardiac MRI available for comparison.</w:t>
+      </w:r>
+      <w:r>
+        <w:rPr>
+          <w:rFonts w:ascii="Arial" w:eastAsia="Arial" w:hAnsi="Arial" w:cs="Arial"/>
+          <w:sz w:val="20"/>
+          <w:szCs w:val="20"/>
+        </w:rPr>
+        <w:t xml:space="preserve"> </w:t>
+      </w:r>
+      <w:r>
+        <w:rPr>
+          <w:rFonts w:ascii="Arial" w:hAnsi="Arial" w:cs="Arial"/>
+          <w:sz w:val="20"/>
+          <w:szCs w:val="20"/>
+        </w:rPr>
+        <w:t>[Comparison is made with</w:t>
+      </w:r>
+      <w:r>
+        <w:rPr>
+          <w:rFonts w:ascii="Arial" w:hAnsi="Arial" w:cs="Arial"/>
+          <w:sz w:val="20"/>
+          <w:szCs w:val="20"/>
+        </w:rPr>
+        <w:t xml:space="preserve"> previous cardiac MRI </w:t>
+      </w:r>
+      <w:r>
+        <w:rPr>
+          <w:rFonts w:ascii="Arial" w:hAnsi="Arial" w:cs="Arial"/>
+          <w:sz w:val="20"/>
+          <w:szCs w:val="20"/>
+        </w:rPr>
+        <w:t>dated [].]</w:t>
       </w:r>
     </w:p>
     <w:p>
@@ -516,64 +525,71 @@
           <w:szCs w:val="20"/>
           <w:u w:val="single"/>
         </w:rPr>
-        <w:t xml:space="preserve">Cardiovascular Anatomy: </w:t>
-      </w:r>
-      <w:r>
-        <w:rPr>
-          <w:rFonts w:ascii="Arial" w:hAnsi="Arial" w:cs="Arial"/>
-          <w:sz w:val="20"/>
-          <w:szCs w:val="20"/>
-        </w:rPr>
-        <w:t>Not provided in source export.</w:t>
-      </w:r>
-      <w:r>
-        <w:rPr>
-          <w:rFonts w:ascii="Arial" w:hAnsi="Arial" w:cs="Arial"/>
-          <w:sz w:val="20"/>
-          <w:szCs w:val="20"/>
-        </w:rPr>
-      </w:r>
-      <w:r>
-        <w:rPr>
-          <w:rFonts w:ascii="Arial" w:hAnsi="Arial" w:cs="Arial"/>
-          <w:sz w:val="20"/>
-          <w:szCs w:val="20"/>
-        </w:rPr>
-      </w:r>
-      <w:r>
-        <w:rPr>
-          <w:rFonts w:ascii="Arial" w:hAnsi="Arial" w:cs="Arial"/>
-          <w:sz w:val="20"/>
-          <w:szCs w:val="20"/>
-        </w:rPr>
-      </w:r>
-      <w:r>
-        <w:rPr>
-          <w:rFonts w:ascii="Arial" w:hAnsi="Arial" w:cs="Arial"/>
-          <w:sz w:val="20"/>
-          <w:szCs w:val="20"/>
-        </w:rPr>
-      </w:r>
-      <w:r>
-        <w:rPr>
-          <w:rFonts w:ascii="Arial" w:hAnsi="Arial" w:cs="Arial"/>
-          <w:sz w:val="20"/>
-          <w:szCs w:val="20"/>
-        </w:rPr>
-      </w:r>
-      <w:r>
-        <w:rPr>
-          <w:rFonts w:ascii="Arial" w:hAnsi="Arial" w:cs="Arial"/>
-          <w:sz w:val="20"/>
-          <w:szCs w:val="20"/>
-        </w:rPr>
-      </w:r>
-      <w:r>
-        <w:rPr>
-          <w:rFonts w:ascii="Arial" w:hAnsi="Arial" w:cs="Arial"/>
-          <w:sz w:val="20"/>
-          <w:szCs w:val="20"/>
-        </w:rPr>
+        <w:t>Cardiovascular Anatomy:</w:t>
+      </w:r>
+      <w:r>
+        <w:rPr>
+          <w:rFonts w:ascii="Arial" w:hAnsi="Arial" w:cs="Arial"/>
+          <w:sz w:val="20"/>
+          <w:szCs w:val="20"/>
+        </w:rPr>
+        <w:t xml:space="preserve"> </w:t>
+      </w:r>
+      <w:r>
+        <w:rPr>
+          <w:rFonts w:ascii="Arial" w:hAnsi="Arial" w:cs="Arial"/>
+          <w:sz w:val="20"/>
+          <w:szCs w:val="20"/>
+        </w:rPr>
+        <w:t>[]</w:t>
+      </w:r>
+      <w:r>
+        <w:rPr>
+          <w:rFonts w:ascii="Arial" w:hAnsi="Arial" w:cs="Arial"/>
+          <w:sz w:val="20"/>
+          <w:szCs w:val="20"/>
+        </w:rPr>
+        <w:t xml:space="preserve"> atrioventricular and ventriculoarterial connections. </w:t>
+      </w:r>
+      <w:r>
+        <w:rPr>
+          <w:rFonts w:ascii="Arial" w:hAnsi="Arial" w:cs="Arial"/>
+          <w:sz w:val="20"/>
+          <w:szCs w:val="20"/>
+        </w:rPr>
+        <w:t>[ Normal</w:t>
+      </w:r>
+      <w:r>
+        <w:rPr>
+          <w:rFonts w:ascii="Arial" w:hAnsi="Arial" w:cs="Arial"/>
+          <w:sz w:val="20"/>
+          <w:szCs w:val="20"/>
+        </w:rPr>
+        <w:t xml:space="preserve"> drainage of the SVC and IVC into the right atrium. </w:t>
+      </w:r>
+      <w:r>
+        <w:rPr>
+          <w:rFonts w:ascii="Arial" w:hAnsi="Arial" w:cs="Arial"/>
+          <w:sz w:val="20"/>
+          <w:szCs w:val="20"/>
+        </w:rPr>
+        <w:t>[]</w:t>
+      </w:r>
+      <w:r>
+        <w:rPr>
+          <w:rFonts w:ascii="Arial" w:hAnsi="Arial" w:cs="Arial"/>
+          <w:sz w:val="20"/>
+          <w:szCs w:val="20"/>
+        </w:rPr>
+        <w:t xml:space="preserve"> pulmonary venous drainage into the left atrium.</w:t>
+      </w:r>
+      <w:r>
+        <w:rPr>
+          <w:rFonts w:ascii="Arial" w:hAnsi="Arial" w:cs="Arial"/>
+          <w:sz w:val="20"/>
+          <w:szCs w:val="20"/>
+        </w:rPr>
+        <w:t>]</w:t>
       </w:r>
     </w:p>
     <w:p>
@@ -641,15 +657,15 @@
           <w:szCs w:val="20"/>
           <w:u w:val="single"/>
         </w:rPr>
-        <w:t xml:space="preserve">Aorta: </w:t>
-      </w:r>
-      <w:r>
-        <w:rPr>
-          <w:rFonts w:ascii="Arial" w:hAnsi="Arial" w:cs="Arial"/>
-          <w:sz w:val="20"/>
-          <w:szCs w:val="20"/>
-        </w:rPr>
-        <w:t>Aortic sinus measurement Not provided in source export.</w:t>
+        <w:t>Aorta:</w:t>
+      </w:r>
+      <w:r>
+        <w:rPr>
+          <w:rFonts w:ascii="Arial" w:hAnsi="Arial" w:cs="Arial"/>
+          <w:sz w:val="20"/>
+          <w:szCs w:val="20"/>
+        </w:rPr>
+        <w:t xml:space="preserve"> Not dilated. Aortic sinus measures [] mm in diameter.</w:t>
       </w:r>
     </w:p>
     <w:p>
@@ -717,36 +733,39 @@
           <w:szCs w:val="20"/>
           <w:u w:val="single"/>
         </w:rPr>
-        <w:t xml:space="preserve">Pulmonary Arteries: </w:t>
-      </w:r>
-      <w:r>
-        <w:rPr>
-          <w:rFonts w:ascii="Arial" w:hAnsi="Arial" w:cs="Arial"/>
-          <w:sz w:val="20"/>
-          <w:szCs w:val="20"/>
-        </w:rPr>
-        <w:t>Main pulmonary artery assessment Not provided in source export.</w:t>
-      </w:r>
-      <w:r>
-        <w:rPr>
-          <w:rFonts w:ascii="Arial" w:hAnsi="Arial" w:cs="Arial"/>
-          <w:sz w:val="20"/>
-          <w:szCs w:val="20"/>
-        </w:rPr>
-      </w:r>
-      <w:r>
-        <w:rPr>
-          <w:rFonts w:ascii="Arial" w:hAnsi="Arial" w:cs="Arial"/>
-          <w:sz w:val="20"/>
-          <w:szCs w:val="20"/>
-        </w:rPr>
-      </w:r>
-      <w:r>
-        <w:rPr>
-          <w:rFonts w:ascii="Arial" w:hAnsi="Arial" w:cs="Arial"/>
-          <w:sz w:val="20"/>
-          <w:szCs w:val="20"/>
-        </w:rPr>
+        <w:t>Pulmonary Arteries:</w:t>
+      </w:r>
+      <w:r>
+        <w:rPr>
+          <w:rFonts w:ascii="Arial" w:hAnsi="Arial" w:cs="Arial"/>
+          <w:sz w:val="20"/>
+          <w:szCs w:val="20"/>
+        </w:rPr>
+        <w:t xml:space="preserve"> Main pulmonary artery is []</w:t>
+      </w:r>
+      <w:r>
+        <w:rPr>
+          <w:rFonts w:ascii="Arial" w:hAnsi="Arial" w:cs="Arial"/>
+          <w:sz w:val="20"/>
+          <w:szCs w:val="20"/>
+        </w:rPr>
+        <w:t xml:space="preserve"> dilated</w:t>
+      </w:r>
+      <w:r>
+        <w:rPr>
+          <w:rFonts w:ascii="Arial" w:hAnsi="Arial" w:cs="Arial"/>
+          <w:sz w:val="20"/>
+          <w:szCs w:val="20"/>
+        </w:rPr>
+        <w:t xml:space="preserve">. Diameter is [] mm. </w:t>
+      </w:r>
+      <w:r>
+        <w:rPr>
+          <w:rFonts w:ascii="Arial" w:hAnsi="Arial" w:cs="Arial"/>
+          <w:sz w:val="20"/>
+          <w:szCs w:val="20"/>
+        </w:rPr>
+        <w:t xml:space="preserve">[] </w:t>
       </w:r>
       <w:bookmarkStart w:id="1" w:name="_Hlk199406645"/>
       <w:r>
@@ -755,48 +774,55 @@
           <w:sz w:val="20"/>
           <w:szCs w:val="20"/>
         </w:rPr>
-      </w:r>
-      <w:r>
-        <w:rPr>
-          <w:rFonts w:ascii="Arial" w:hAnsi="Arial" w:cs="Arial"/>
-          <w:sz w:val="20"/>
-          <w:szCs w:val="20"/>
-        </w:rPr>
-      </w:r>
-      <w:r>
-        <w:rPr>
-          <w:rFonts w:ascii="Arial" w:hAnsi="Arial" w:cs="Arial"/>
-          <w:sz w:val="20"/>
-          <w:szCs w:val="20"/>
-        </w:rPr>
-      </w:r>
-      <w:r>
-        <w:rPr>
-          <w:rFonts w:ascii="Arial" w:hAnsi="Arial" w:cs="Arial"/>
-          <w:sz w:val="20"/>
-          <w:szCs w:val="20"/>
-        </w:rPr>
-      </w:r>
-      <w:r>
-        <w:rPr>
-          <w:rFonts w:ascii="Arial" w:hAnsi="Arial" w:cs="Arial"/>
-          <w:sz w:val="20"/>
-          <w:szCs w:val="20"/>
-        </w:rPr>
-      </w:r>
-      <w:r>
-        <w:rPr>
-          <w:rFonts w:ascii="Arial" w:hAnsi="Arial" w:cs="Arial"/>
-          <w:sz w:val="20"/>
-          <w:szCs w:val="20"/>
-        </w:rPr>
-      </w:r>
-      <w:r>
-        <w:rPr>
-          <w:rFonts w:ascii="Arial" w:hAnsi="Arial" w:cs="Arial"/>
-          <w:sz w:val="20"/>
-          <w:szCs w:val="20"/>
-        </w:rPr>
+        <w:t>Th</w:t>
+      </w:r>
+      <w:r>
+        <w:rPr>
+          <w:rFonts w:ascii="Arial" w:hAnsi="Arial" w:cs="Arial"/>
+          <w:sz w:val="20"/>
+          <w:szCs w:val="20"/>
+        </w:rPr>
+        <w:t>is</w:t>
+      </w:r>
+      <w:r>
+        <w:rPr>
+          <w:rFonts w:ascii="Arial" w:hAnsi="Arial" w:cs="Arial"/>
+          <w:sz w:val="20"/>
+          <w:szCs w:val="20"/>
+        </w:rPr>
+        <w:t xml:space="preserve"> is suspicio</w:t>
+      </w:r>
+      <w:r>
+        <w:rPr>
+          <w:rFonts w:ascii="Arial" w:hAnsi="Arial" w:cs="Arial"/>
+          <w:sz w:val="20"/>
+          <w:szCs w:val="20"/>
+        </w:rPr>
+        <w:t>us</w:t>
+      </w:r>
+      <w:r>
+        <w:rPr>
+          <w:rFonts w:ascii="Arial" w:hAnsi="Arial" w:cs="Arial"/>
+          <w:sz w:val="20"/>
+          <w:szCs w:val="20"/>
+        </w:rPr>
+        <w:t xml:space="preserve"> </w:t>
+      </w:r>
+      <w:r>
+        <w:rPr>
+          <w:rFonts w:ascii="Arial" w:hAnsi="Arial" w:cs="Arial"/>
+          <w:sz w:val="20"/>
+          <w:szCs w:val="20"/>
+        </w:rPr>
+        <w:t xml:space="preserve">for </w:t>
+      </w:r>
+      <w:r>
+        <w:rPr>
+          <w:rFonts w:ascii="Arial" w:hAnsi="Arial" w:cs="Arial"/>
+          <w:sz w:val="20"/>
+          <w:szCs w:val="20"/>
+        </w:rPr>
+        <w:t>pulmonary hypertension.</w:t>
       </w:r>
     </w:p>
     <w:bookmarkEnd w:id="1"/>
@@ -862,15 +888,15 @@
           <w:szCs w:val="20"/>
           <w:u w:val="single"/>
         </w:rPr>
-        <w:t xml:space="preserve">Left Atrium: </w:t>
-      </w:r>
-      <w:r>
-        <w:rPr>
-          <w:rFonts w:ascii="Arial" w:eastAsia="Arial" w:hAnsi="Arial" w:cs="Arial"/>
-          <w:sz w:val="20"/>
-          <w:szCs w:val="20"/>
-        </w:rPr>
-        <w:t>size/reference classification Not provided in source export.</w:t>
+        <w:t>Left Atrium:</w:t>
+      </w:r>
+      <w:r>
+        <w:rPr>
+          <w:rFonts w:ascii="Arial" w:eastAsia="Arial" w:hAnsi="Arial" w:cs="Arial"/>
+          <w:sz w:val="20"/>
+          <w:szCs w:val="20"/>
+        </w:rPr>
+        <w:t xml:space="preserve"> [] for size.</w:t>
       </w:r>
     </w:p>
     <w:p>
@@ -932,15 +958,15 @@
           <w:szCs w:val="20"/>
           <w:u w:val="single"/>
         </w:rPr>
-        <w:t xml:space="preserve">Right Atrium: </w:t>
-      </w:r>
-      <w:r>
-        <w:rPr>
-          <w:rFonts w:ascii="Arial" w:eastAsia="Arial" w:hAnsi="Arial" w:cs="Arial"/>
-          <w:sz w:val="20"/>
-          <w:szCs w:val="20"/>
-        </w:rPr>
-        <w:t>size assessment Not provided in source export.</w:t>
+        <w:t>Right Atrium:</w:t>
+      </w:r>
+      <w:r>
+        <w:rPr>
+          <w:rFonts w:ascii="Arial" w:eastAsia="Arial" w:hAnsi="Arial" w:cs="Arial"/>
+          <w:sz w:val="20"/>
+          <w:szCs w:val="20"/>
+        </w:rPr>
+        <w:t xml:space="preserve"> [] for size.</w:t>
       </w:r>
     </w:p>
     <w:p>
@@ -1008,29 +1034,31 @@
           <w:szCs w:val="20"/>
           <w:u w:val="single"/>
         </w:rPr>
-        <w:t xml:space="preserve">Left Ventricle: </w:t>
-      </w:r>
-      <w:r>
-        <w:rPr>
-          <w:rFonts w:ascii="Arial" w:hAnsi="Arial" w:cs="Arial"/>
-          <w:sz w:val="20"/>
-          <w:szCs w:val="20"/>
-        </w:rPr>
-        <w:t>LV volumes and systolic function: EF 61.4 %; EDV 148.8 mL; ESV 57.5 mL; LV hypertrophy: cannot be assessed from the measurements provided; maximum LV wall thickness: 11.7 mm; LV mass: 92.5 g.</w:t>
-      </w:r>
-      <w:r>
-        <w:rPr>
-          <w:rFonts w:ascii="Arial" w:hAnsi="Arial" w:cs="Arial"/>
-          <w:sz w:val="20"/>
-          <w:szCs w:val="20"/>
-        </w:rPr>
-      </w:r>
-      <w:r>
-        <w:rPr>
-          <w:rFonts w:ascii="Arial" w:hAnsi="Arial" w:cs="Arial"/>
-          <w:sz w:val="20"/>
-          <w:szCs w:val="20"/>
-        </w:rPr>
+        <w:t>Left Ventricle:</w:t>
+      </w:r>
+      <w:r>
+        <w:rPr>
+          <w:rFonts w:ascii="Arial" w:hAnsi="Arial" w:cs="Arial"/>
+          <w:sz w:val="20"/>
+          <w:szCs w:val="20"/>
+        </w:rPr>
+        <w:t xml:space="preserve"> abnormal LV </w:t>
+      </w:r>
+      <w:r>
+        <w:rPr>
+          <w:rFonts w:ascii="Arial" w:hAnsi="Arial" w:cs="Arial"/>
+          <w:sz w:val="20"/>
+          <w:szCs w:val="20"/>
+        </w:rPr>
+        <w:t>volumes</w:t>
+      </w:r>
+      <w:r>
+        <w:rPr>
+          <w:rFonts w:ascii="Arial" w:hAnsi="Arial" w:cs="Arial"/>
+          <w:sz w:val="20"/>
+          <w:szCs w:val="20"/>
+        </w:rPr>
+        <w:t xml:space="preserve"> and systolic function. normal LV hypertrophy. Maximum LV wall thickness is [] mm in end-diastole. normal LV mass. </w:t>
       </w:r>
     </w:p>
     <w:p>
@@ -1098,29 +1126,31 @@
           <w:szCs w:val="20"/>
           <w:u w:val="single"/>
         </w:rPr>
-        <w:t xml:space="preserve">Right Ventricle: </w:t>
-      </w:r>
-      <w:r>
-        <w:rPr>
-          <w:rFonts w:ascii="Arial" w:hAnsi="Arial" w:cs="Arial"/>
-          <w:sz w:val="20"/>
-          <w:szCs w:val="20"/>
-        </w:rPr>
-        <w:t>EF 63.2 %; EDV 146.0 mL; ESV 53.7 mL.</w:t>
-      </w:r>
-      <w:r>
-        <w:rPr>
-          <w:rFonts w:ascii="Arial" w:hAnsi="Arial" w:cs="Arial"/>
-          <w:sz w:val="20"/>
-          <w:szCs w:val="20"/>
-        </w:rPr>
-      </w:r>
-      <w:r>
-        <w:rPr>
-          <w:rFonts w:ascii="Arial" w:hAnsi="Arial" w:cs="Arial"/>
-          <w:sz w:val="20"/>
-          <w:szCs w:val="20"/>
-        </w:rPr>
+        <w:t>Right Ventricle:</w:t>
+      </w:r>
+      <w:r>
+        <w:rPr>
+          <w:rFonts w:ascii="Arial" w:hAnsi="Arial" w:cs="Arial"/>
+          <w:sz w:val="20"/>
+          <w:szCs w:val="20"/>
+        </w:rPr>
+        <w:t xml:space="preserve"> abnormal RV </w:t>
+      </w:r>
+      <w:r>
+        <w:rPr>
+          <w:rFonts w:ascii="Arial" w:hAnsi="Arial" w:cs="Arial"/>
+          <w:sz w:val="20"/>
+          <w:szCs w:val="20"/>
+        </w:rPr>
+        <w:t>volumes</w:t>
+      </w:r>
+      <w:r>
+        <w:rPr>
+          <w:rFonts w:ascii="Arial" w:hAnsi="Arial" w:cs="Arial"/>
+          <w:sz w:val="20"/>
+          <w:szCs w:val="20"/>
+        </w:rPr>
+        <w:t xml:space="preserve"> and systolic function.</w:t>
       </w:r>
     </w:p>
     <w:p>
@@ -1188,15 +1218,15 @@
           <w:szCs w:val="20"/>
           <w:u w:val="single"/>
         </w:rPr>
-        <w:t xml:space="preserve">Aortic Valve: </w:t>
-      </w:r>
-      <w:r>
-        <w:rPr>
-          <w:rFonts w:ascii="Arial" w:hAnsi="Arial" w:cs="Arial"/>
-          <w:sz w:val="20"/>
-          <w:szCs w:val="20"/>
-        </w:rPr>
-        <w:t>assessment Not provided in source export.</w:t>
+        <w:t>Aortic Valve:</w:t>
+      </w:r>
+      <w:r>
+        <w:rPr>
+          <w:rFonts w:ascii="Arial" w:hAnsi="Arial" w:cs="Arial"/>
+          <w:sz w:val="20"/>
+          <w:szCs w:val="20"/>
+        </w:rPr>
+        <w:t xml:space="preserve"> [] appearances and function.</w:t>
       </w:r>
     </w:p>
     <w:p>
@@ -1264,15 +1294,15 @@
           <w:szCs w:val="20"/>
           <w:u w:val="single"/>
         </w:rPr>
-        <w:t xml:space="preserve">Pulmonary Valve: </w:t>
-      </w:r>
-      <w:r>
-        <w:rPr>
-          <w:rFonts w:ascii="Arial" w:hAnsi="Arial" w:cs="Arial"/>
-          <w:sz w:val="20"/>
-          <w:szCs w:val="20"/>
-        </w:rPr>
-        <w:t>assessment Not provided in source export.</w:t>
+        <w:t>Pulmonary Valve:</w:t>
+      </w:r>
+      <w:r>
+        <w:rPr>
+          <w:rFonts w:ascii="Arial" w:hAnsi="Arial" w:cs="Arial"/>
+          <w:sz w:val="20"/>
+          <w:szCs w:val="20"/>
+        </w:rPr>
+        <w:t xml:space="preserve"> [] appearances and function.</w:t>
       </w:r>
     </w:p>
     <w:p>
@@ -1340,15 +1370,15 @@
           <w:szCs w:val="20"/>
           <w:u w:val="single"/>
         </w:rPr>
-        <w:t xml:space="preserve">Mitral Valve: </w:t>
-      </w:r>
-      <w:r>
-        <w:rPr>
-          <w:rFonts w:ascii="Arial" w:hAnsi="Arial" w:cs="Arial"/>
-          <w:sz w:val="20"/>
-          <w:szCs w:val="20"/>
-        </w:rPr>
-        <w:t>assessment Not provided in source export.</w:t>
+        <w:t>Mitral Valve:</w:t>
+      </w:r>
+      <w:r>
+        <w:rPr>
+          <w:rFonts w:ascii="Arial" w:hAnsi="Arial" w:cs="Arial"/>
+          <w:sz w:val="20"/>
+          <w:szCs w:val="20"/>
+        </w:rPr>
+        <w:t xml:space="preserve"> [] appearances and function.</w:t>
       </w:r>
     </w:p>
     <w:p>
@@ -1416,15 +1446,15 @@
           <w:szCs w:val="20"/>
           <w:u w:val="single"/>
         </w:rPr>
-        <w:t xml:space="preserve">Tricuspid Valve: </w:t>
-      </w:r>
-      <w:r>
-        <w:rPr>
-          <w:rFonts w:ascii="Arial" w:hAnsi="Arial" w:cs="Arial"/>
-          <w:sz w:val="20"/>
-          <w:szCs w:val="20"/>
-        </w:rPr>
-        <w:t>assessment Not provided in source export.</w:t>
+        <w:t>Tricuspid Valve:</w:t>
+      </w:r>
+      <w:r>
+        <w:rPr>
+          <w:rFonts w:ascii="Arial" w:hAnsi="Arial" w:cs="Arial"/>
+          <w:sz w:val="20"/>
+          <w:szCs w:val="20"/>
+        </w:rPr>
+        <w:t xml:space="preserve"> [] appearances and function.</w:t>
       </w:r>
     </w:p>
     <w:p>
@@ -1492,15 +1522,15 @@
           <w:szCs w:val="20"/>
           <w:u w:val="single"/>
         </w:rPr>
-        <w:t xml:space="preserve">Pericardium: </w:t>
-      </w:r>
-      <w:r>
-        <w:rPr>
-          <w:rFonts w:ascii="Arial" w:hAnsi="Arial" w:cs="Arial"/>
-          <w:sz w:val="20"/>
-          <w:szCs w:val="20"/>
-        </w:rPr>
-        <w:t>assessment Not provided in source export.</w:t>
+        <w:t>Pericardium:</w:t>
+      </w:r>
+      <w:r>
+        <w:rPr>
+          <w:rFonts w:ascii="Arial" w:hAnsi="Arial" w:cs="Arial"/>
+          <w:sz w:val="20"/>
+          <w:szCs w:val="20"/>
+        </w:rPr>
+        <w:t xml:space="preserve"> [] effusion or thickening.</w:t>
       </w:r>
     </w:p>
     <w:p>
@@ -1565,7 +1595,7 @@
           <w:szCs w:val="20"/>
           <w:u w:val="single"/>
         </w:rPr>
-        <w:t xml:space="preserve">Oedema Imaging (T2 Mapping/T2 STIR): </w:t>
+        <w:t>Oedema</w:t>
       </w:r>
       <w:proofErr w:type="spellEnd"/>
       <w:r>
@@ -1576,7 +1606,7 @@
           <w:szCs w:val="20"/>
           <w:u w:val="single"/>
         </w:rPr>
-        <w:t>Not provided in source export.</w:t>
+        <w:t xml:space="preserve"> Imaging (T2 </w:t>
       </w:r>
       <w:r>
         <w:rPr>
@@ -1586,6 +1616,7 @@
           <w:szCs w:val="20"/>
           <w:u w:val="single"/>
         </w:rPr>
+        <w:t>Map</w:t>
       </w:r>
       <w:r>
         <w:rPr>
@@ -1595,6 +1626,7 @@
           <w:szCs w:val="20"/>
           <w:u w:val="single"/>
         </w:rPr>
+        <w:t>ping</w:t>
       </w:r>
       <w:r>
         <w:rPr>
@@ -1604,6 +1636,7 @@
           <w:szCs w:val="20"/>
           <w:u w:val="single"/>
         </w:rPr>
+        <w:t>/</w:t>
       </w:r>
       <w:r>
         <w:rPr>
@@ -1613,6 +1646,7 @@
           <w:szCs w:val="20"/>
           <w:u w:val="single"/>
         </w:rPr>
+        <w:t>T2</w:t>
       </w:r>
       <w:r>
         <w:rPr>
@@ -1622,6 +1656,7 @@
           <w:szCs w:val="20"/>
           <w:u w:val="single"/>
         </w:rPr>
+        <w:t xml:space="preserve"> </w:t>
       </w:r>
       <w:r>
         <w:rPr>
@@ -1631,13 +1666,15 @@
           <w:szCs w:val="20"/>
           <w:u w:val="single"/>
         </w:rPr>
-      </w:r>
-      <w:r>
-        <w:rPr>
-          <w:rFonts w:ascii="Arial" w:eastAsia="Arial" w:hAnsi="Arial" w:cs="Arial"/>
-          <w:sz w:val="20"/>
-          <w:szCs w:val="20"/>
-        </w:rPr>
+        <w:t>STIR):</w:t>
+      </w:r>
+      <w:r>
+        <w:rPr>
+          <w:rFonts w:ascii="Arial" w:eastAsia="Arial" w:hAnsi="Arial" w:cs="Arial"/>
+          <w:sz w:val="20"/>
+          <w:szCs w:val="20"/>
+        </w:rPr>
+        <w:t xml:space="preserve"> [] </w:t>
       </w:r>
       <w:proofErr w:type="spellStart"/>
       <w:r>
@@ -1646,6 +1683,7 @@
           <w:sz w:val="20"/>
           <w:szCs w:val="20"/>
         </w:rPr>
+        <w:t>oedema</w:t>
       </w:r>
       <w:proofErr w:type="spellEnd"/>
       <w:r>
@@ -1654,27 +1692,31 @@
           <w:sz w:val="20"/>
           <w:szCs w:val="20"/>
         </w:rPr>
-      </w:r>
-      <w:r>
-        <w:rPr>
-          <w:rFonts w:ascii="Arial" w:eastAsia="Arial" w:hAnsi="Arial" w:cs="Arial"/>
-          <w:sz w:val="20"/>
-          <w:szCs w:val="20"/>
-        </w:rPr>
-      </w:r>
-      <w:r>
-        <w:rPr>
-          <w:rFonts w:ascii="Arial" w:eastAsia="Arial" w:hAnsi="Arial" w:cs="Arial"/>
-          <w:sz w:val="20"/>
-          <w:szCs w:val="20"/>
-        </w:rPr>
-      </w:r>
-      <w:r>
-        <w:rPr>
-          <w:rFonts w:ascii="Arial" w:eastAsia="Arial" w:hAnsi="Arial" w:cs="Arial"/>
-          <w:sz w:val="20"/>
-          <w:szCs w:val="20"/>
-        </w:rPr>
+        <w:t>.</w:t>
+      </w:r>
+      <w:r>
+        <w:rPr>
+          <w:rFonts w:ascii="Arial" w:eastAsia="Arial" w:hAnsi="Arial" w:cs="Arial"/>
+          <w:sz w:val="20"/>
+          <w:szCs w:val="20"/>
+        </w:rPr>
+        <w:t xml:space="preserve"> </w:t>
+      </w:r>
+      <w:r>
+        <w:rPr>
+          <w:rFonts w:ascii="Arial" w:eastAsia="Arial" w:hAnsi="Arial" w:cs="Arial"/>
+          <w:sz w:val="20"/>
+          <w:szCs w:val="20"/>
+        </w:rPr>
+        <w:t>[]</w:t>
+      </w:r>
+      <w:r>
+        <w:rPr>
+          <w:rFonts w:ascii="Arial" w:eastAsia="Arial" w:hAnsi="Arial" w:cs="Arial"/>
+          <w:sz w:val="20"/>
+          <w:szCs w:val="20"/>
+        </w:rPr>
+        <w:t xml:space="preserve"> native T2 value.</w:t>
       </w:r>
     </w:p>
     <w:p>
@@ -1739,7 +1781,7 @@
           <w:szCs w:val="20"/>
           <w:u w:val="single"/>
         </w:rPr>
-        <w:t xml:space="preserve">Late Gadolinium Enhancement (LGE/T1 Mapping): </w:t>
+        <w:t>Late Gadolinium Enhancement (LGE</w:t>
       </w:r>
       <w:r>
         <w:rPr>
@@ -1749,7 +1791,7 @@
           <w:szCs w:val="20"/>
           <w:u w:val="single"/>
         </w:rPr>
-        <w:t>Not provided in source export.</w:t>
+        <w:t>/T1</w:t>
       </w:r>
       <w:r>
         <w:rPr>
@@ -1759,6 +1801,7 @@
           <w:szCs w:val="20"/>
           <w:u w:val="single"/>
         </w:rPr>
+        <w:t xml:space="preserve"> Mapping</w:t>
       </w:r>
       <w:r>
         <w:rPr>
@@ -1768,27 +1811,31 @@
           <w:szCs w:val="20"/>
           <w:u w:val="single"/>
         </w:rPr>
-      </w:r>
-      <w:r>
-        <w:rPr>
-          <w:rFonts w:ascii="Arial" w:hAnsi="Arial" w:cs="Arial"/>
-          <w:sz w:val="20"/>
-          <w:szCs w:val="20"/>
-        </w:rPr>
-      </w:r>
-      <w:r>
-        <w:rPr>
-          <w:rFonts w:ascii="Arial" w:eastAsia="Arial" w:hAnsi="Arial" w:cs="Arial"/>
-          <w:sz w:val="20"/>
-          <w:szCs w:val="20"/>
-        </w:rPr>
-      </w:r>
-      <w:r>
-        <w:rPr>
-          <w:rFonts w:ascii="Arial" w:eastAsia="Arial" w:hAnsi="Arial" w:cs="Arial"/>
-          <w:sz w:val="20"/>
-          <w:szCs w:val="20"/>
-        </w:rPr>
+        <w:t>):</w:t>
+      </w:r>
+      <w:r>
+        <w:rPr>
+          <w:rFonts w:ascii="Arial" w:hAnsi="Arial" w:cs="Arial"/>
+          <w:sz w:val="20"/>
+          <w:szCs w:val="20"/>
+        </w:rPr>
+        <w:t xml:space="preserve"> [] LGE or infarct. </w:t>
+      </w:r>
+      <w:r>
+        <w:rPr>
+          <w:rFonts w:ascii="Arial" w:eastAsia="Arial" w:hAnsi="Arial" w:cs="Arial"/>
+          <w:sz w:val="20"/>
+          <w:szCs w:val="20"/>
+        </w:rPr>
+        <w:t>[]</w:t>
+      </w:r>
+      <w:r>
+        <w:rPr>
+          <w:rFonts w:ascii="Arial" w:eastAsia="Arial" w:hAnsi="Arial" w:cs="Arial"/>
+          <w:sz w:val="20"/>
+          <w:szCs w:val="20"/>
+        </w:rPr>
+        <w:t xml:space="preserve"> native T1 value.</w:t>
       </w:r>
     </w:p>
     <w:p>
@@ -1856,22 +1903,23 @@
           <w:szCs w:val="20"/>
           <w:u w:val="single"/>
         </w:rPr>
-        <w:t xml:space="preserve">Extracardiac: </w:t>
-      </w:r>
-      <w:r>
-        <w:rPr>
-          <w:rFonts w:ascii="Arial" w:hAnsi="Arial" w:cs="Arial"/>
-          <w:sz w:val="20"/>
-          <w:szCs w:val="20"/>
-        </w:rPr>
-        <w:t>assessment Not provided in source export.</w:t>
-      </w:r>
-      <w:r>
-        <w:rPr>
-          <w:rFonts w:ascii="Arial" w:hAnsi="Arial" w:cs="Arial"/>
-          <w:sz w:val="20"/>
-          <w:szCs w:val="20"/>
-        </w:rPr>
+        <w:t>Extracardiac:</w:t>
+      </w:r>
+      <w:r>
+        <w:rPr>
+          <w:rFonts w:ascii="Arial" w:hAnsi="Arial" w:cs="Arial"/>
+          <w:sz w:val="20"/>
+          <w:szCs w:val="20"/>
+        </w:rPr>
+        <w:t xml:space="preserve"> []</w:t>
+      </w:r>
+      <w:r>
+        <w:rPr>
+          <w:rFonts w:ascii="Arial" w:hAnsi="Arial" w:cs="Arial"/>
+          <w:sz w:val="20"/>
+          <w:szCs w:val="20"/>
+        </w:rPr>
+        <w:t xml:space="preserve"> Nil</w:t>
       </w:r>
     </w:p>
     <w:p>
@@ -1980,35 +2028,39 @@
           <w:sz w:val="20"/>
           <w:szCs w:val="20"/>
         </w:rPr>
-        <w:t>LV EF 61.4 %; RV EF 63.2 %</w:t>
-      </w:r>
-      <w:r>
-        <w:rPr>
-          <w:rFonts w:ascii="Arial" w:eastAsia="Arial" w:hAnsi="Arial" w:cs="Arial"/>
-          <w:sz w:val="20"/>
-          <w:szCs w:val="20"/>
-        </w:rPr>
-      </w:r>
-      <w:r>
-        <w:rPr>
-          <w:rFonts w:ascii="Arial" w:hAnsi="Arial" w:cs="Arial"/>
-          <w:sz w:val="20"/>
-          <w:szCs w:val="20"/>
-        </w:rPr>
-      </w:r>
-      <w:r>
-        <w:rPr>
-          <w:rFonts w:ascii="Arial" w:hAnsi="Arial" w:cs="Arial"/>
-          <w:sz w:val="20"/>
-          <w:szCs w:val="20"/>
-        </w:rPr>
-      </w:r>
-      <w:r>
-        <w:rPr>
-          <w:rFonts w:ascii="Arial" w:hAnsi="Arial" w:cs="Arial"/>
-          <w:sz w:val="20"/>
-          <w:szCs w:val="20"/>
-        </w:rPr>
+        <w:t>abnormal</w:t>
+      </w:r>
+      <w:r>
+        <w:rPr>
+          <w:rFonts w:ascii="Arial" w:eastAsia="Arial" w:hAnsi="Arial" w:cs="Arial"/>
+          <w:sz w:val="20"/>
+          <w:szCs w:val="20"/>
+        </w:rPr>
+        <w:t xml:space="preserve"> </w:t>
+      </w:r>
+      <w:r>
+        <w:rPr>
+          <w:rFonts w:ascii="Arial" w:hAnsi="Arial" w:cs="Arial"/>
+          <w:sz w:val="20"/>
+          <w:szCs w:val="20"/>
+        </w:rPr>
+        <w:t xml:space="preserve">LV </w:t>
+      </w:r>
+      <w:r>
+        <w:rPr>
+          <w:rFonts w:ascii="Arial" w:hAnsi="Arial" w:cs="Arial"/>
+          <w:sz w:val="20"/>
+          <w:szCs w:val="20"/>
+        </w:rPr>
+        <w:t xml:space="preserve">&amp; RV </w:t>
+      </w:r>
+      <w:r>
+        <w:rPr>
+          <w:rFonts w:ascii="Arial" w:hAnsi="Arial" w:cs="Arial"/>
+          <w:sz w:val="20"/>
+          <w:szCs w:val="20"/>
+        </w:rPr>
+        <w:t>volumes and systolic function.</w:t>
       </w:r>
     </w:p>
     <w:p>
@@ -2052,21 +2104,23 @@
           <w:sz w:val="20"/>
           <w:szCs w:val="20"/>
         </w:rPr>
-        <w:t>LGE or infarct assessment not reported in source export.</w:t>
-      </w:r>
-      <w:r>
-        <w:rPr>
-          <w:rFonts w:ascii="Arial" w:hAnsi="Arial" w:cs="Arial"/>
-          <w:sz w:val="20"/>
-          <w:szCs w:val="20"/>
-        </w:rPr>
-      </w:r>
-      <w:r>
-        <w:rPr>
-          <w:rFonts w:ascii="Arial" w:hAnsi="Arial" w:cs="Arial"/>
-          <w:sz w:val="20"/>
-          <w:szCs w:val="20"/>
-        </w:rPr>
+        <w:t xml:space="preserve">[] </w:t>
+      </w:r>
+      <w:r>
+        <w:rPr>
+          <w:rFonts w:ascii="Arial" w:hAnsi="Arial" w:cs="Arial"/>
+          <w:sz w:val="20"/>
+          <w:szCs w:val="20"/>
+        </w:rPr>
+        <w:t>LGE or infarct</w:t>
+      </w:r>
+      <w:r>
+        <w:rPr>
+          <w:rFonts w:ascii="Arial" w:hAnsi="Arial" w:cs="Arial"/>
+          <w:sz w:val="20"/>
+          <w:szCs w:val="20"/>
+        </w:rPr>
+        <w:t xml:space="preserve"> </w:t>
       </w:r>
       <w:bookmarkStart w:id="2" w:name="_GoBack"/>
       <w:bookmarkEnd w:id="2"/>
@@ -2138,9 +2192,6 @@
                 <w:szCs w:val="20"/>
               </w:rPr>
               <w:t xml:space="preserve">Height: </w:t>
-            </w:r>
-            <w:r>
-              <w:t>Not provided</w:t>
             </w:r>
           </w:p>
         </w:tc>
@@ -2232,10 +2283,7 @@
                 <w:sz w:val="20"/>
                 <w:szCs w:val="20"/>
               </w:rPr>
-              <w:t xml:space="preserve">Weight: </w:t>
-            </w:r>
-            <w:r>
-              <w:t>Not provided</w:t>
+              <w:t>Weight:</w:t>
             </w:r>
           </w:p>
         </w:tc>
@@ -2327,10 +2375,7 @@
                 <w:sz w:val="20"/>
                 <w:szCs w:val="20"/>
               </w:rPr>
-              <w:t xml:space="preserve">BSA: </w:t>
-            </w:r>
-            <w:r>
-              <w:t>1.52 (derived)</w:t>
+              <w:t>BSA:</w:t>
             </w:r>
           </w:p>
         </w:tc>

</xml_diff>